<commit_message>
Docs: capturas de escritorio, web y reportes con los tres roles
</commit_message>
<xml_diff>
--- a/docs/Documentacion_TPI.docx
+++ b/docs/Documentacion_TPI.docx
@@ -115,7 +115,7 @@
               <w:pStyle w:val="Compact"/>
             </w:pPr>
             <w:r>
-              <w:t xml:space="preserve">[COMPLETAR]</w:t>
+              <w:t xml:space="preserve">Tecnologías de Desarrollo de Software IDE</w:t>
             </w:r>
           </w:p>
         </w:tc>
@@ -2194,7 +2194,7 @@
         <w:pStyle w:val="FirstParagraph"/>
       </w:pPr>
       <w:r>
-        <w:t xml:space="preserve">[COMPLETAR: capturas tomadas con los tres roles.]</w:t>
+        <w:t xml:space="preserve">Capturas tomadas con los datos de prueba, ingresando con cada uno de los tres roles: administrador (admin@paseos.com), dueño (ana.gomez@paseos.com) y paseador (carlos.ruiz@paseos.com).</w:t>
       </w:r>
     </w:p>
     <w:bookmarkStart w:id="17" w:name="aplicación-de-escritorio"/>
@@ -2211,13 +2211,887 @@
         <w:pStyle w:val="FirstParagraph"/>
       </w:pPr>
       <w:r>
-        <w:t xml:space="preserve">[COMPLETAR: login, menú principal por rol, Dueños, Paseadores, Perros, Paseos (con filtros),</w:t>
-      </w:r>
-      <w:r>
-        <w:t xml:space="preserve"> </w:t>
-      </w:r>
-      <w:r>
-        <w:t xml:space="preserve">Administradores y Liquidaciones.]</w:t>
+        <w:t xml:space="preserve">El menú de la ventana principal muestra solo las opciones que el rol puede usar. Cada pantalla de ABMC tiene el formulario de carga a la izquierda y la grilla a la derecha; con doble clic en una fila se carga para modificarla.</w:t>
+      </w:r>
+    </w:p>
+    <w:p>
+      <w:pPr>
+        <w:pStyle w:val="CaptionedFigure"/>
+      </w:pPr>
+      <w:r>
+        <w:drawing>
+          <wp:inline>
+            <wp:extent cx="3200400" cy="2754040"/>
+            <wp:effectExtent b="0" l="0" r="0" t="0"/>
+            <wp:docPr descr="Escritorio: inicio de sesión" title="" id="1000" name="Picture"/>
+            <a:graphic>
+              <a:graphicData uri="http://schemas.openxmlformats.org/drawingml/2006/picture">
+                <pic:pic>
+                  <pic:nvPicPr>
+                    <pic:cNvPr descr="capturas/esc-01-login.png" id="1001" name="Picture"/>
+                    <pic:cNvPicPr>
+                      <a:picLocks noChangeArrowheads="1" noChangeAspect="1"/>
+                    </pic:cNvPicPr>
+                  </pic:nvPicPr>
+                  <pic:blipFill>
+                    <a:blip r:embed="rIdCap1"/>
+                    <a:stretch>
+                      <a:fillRect/>
+                    </a:stretch>
+                  </pic:blipFill>
+                  <pic:spPr bwMode="auto">
+                    <a:xfrm>
+                      <a:off x="0" y="0"/>
+                      <a:ext cx="3200400" cy="2754040"/>
+                    </a:xfrm>
+                    <a:prstGeom prst="rect">
+                      <a:avLst/>
+                    </a:prstGeom>
+                    <a:noFill/>
+                    <a:ln w="9525">
+                      <a:noFill/>
+                      <a:headEnd/>
+                      <a:tailEnd/>
+                    </a:ln>
+                  </pic:spPr>
+                </pic:pic>
+              </a:graphicData>
+            </a:graphic>
+          </wp:inline>
+        </w:drawing>
+      </w:r>
+    </w:p>
+    <w:p>
+      <w:pPr>
+        <w:pStyle w:val="ImageCaption"/>
+      </w:pPr>
+      <w:r>
+        <w:t xml:space="preserve">Escritorio: inicio de sesión</w:t>
+      </w:r>
+    </w:p>
+    <w:p>
+      <w:pPr>
+        <w:pStyle w:val="CaptionedFigure"/>
+      </w:pPr>
+      <w:r>
+        <w:drawing>
+          <wp:inline>
+            <wp:extent cx="5943600" cy="2745137"/>
+            <wp:effectExtent b="0" l="0" r="0" t="0"/>
+            <wp:docPr descr="Escritorio: menú Gestión del administrador" title="" id="1002" name="Picture"/>
+            <a:graphic>
+              <a:graphicData uri="http://schemas.openxmlformats.org/drawingml/2006/picture">
+                <pic:pic>
+                  <pic:nvPicPr>
+                    <pic:cNvPr descr="capturas/esc-menu-admin.png" id="1003" name="Picture"/>
+                    <pic:cNvPicPr>
+                      <a:picLocks noChangeArrowheads="1" noChangeAspect="1"/>
+                    </pic:cNvPicPr>
+                  </pic:nvPicPr>
+                  <pic:blipFill>
+                    <a:blip r:embed="rIdCap3"/>
+                    <a:stretch>
+                      <a:fillRect/>
+                    </a:stretch>
+                  </pic:blipFill>
+                  <pic:spPr bwMode="auto">
+                    <a:xfrm>
+                      <a:off x="0" y="0"/>
+                      <a:ext cx="5943600" cy="2745137"/>
+                    </a:xfrm>
+                    <a:prstGeom prst="rect">
+                      <a:avLst/>
+                    </a:prstGeom>
+                    <a:noFill/>
+                    <a:ln w="9525">
+                      <a:noFill/>
+                      <a:headEnd/>
+                      <a:tailEnd/>
+                    </a:ln>
+                  </pic:spPr>
+                </pic:pic>
+              </a:graphicData>
+            </a:graphic>
+          </wp:inline>
+        </w:drawing>
+      </w:r>
+    </w:p>
+    <w:p>
+      <w:pPr>
+        <w:pStyle w:val="ImageCaption"/>
+      </w:pPr>
+      <w:r>
+        <w:t xml:space="preserve">Escritorio: menú Gestión del administrador</w:t>
+      </w:r>
+    </w:p>
+    <w:p>
+      <w:pPr>
+        <w:pStyle w:val="CaptionedFigure"/>
+      </w:pPr>
+      <w:r>
+        <w:drawing>
+          <wp:inline>
+            <wp:extent cx="5943600" cy="1880886"/>
+            <wp:effectExtent b="0" l="0" r="0" t="0"/>
+            <wp:docPr descr="Escritorio: menú Reportes del administrador" title="" id="1004" name="Picture"/>
+            <a:graphic>
+              <a:graphicData uri="http://schemas.openxmlformats.org/drawingml/2006/picture">
+                <pic:pic>
+                  <pic:nvPicPr>
+                    <pic:cNvPr descr="capturas/esc-menu-admin-reportes.png" id="1005" name="Picture"/>
+                    <pic:cNvPicPr>
+                      <a:picLocks noChangeArrowheads="1" noChangeAspect="1"/>
+                    </pic:cNvPicPr>
+                  </pic:nvPicPr>
+                  <pic:blipFill>
+                    <a:blip r:embed="rIdCap5"/>
+                    <a:stretch>
+                      <a:fillRect/>
+                    </a:stretch>
+                  </pic:blipFill>
+                  <pic:spPr bwMode="auto">
+                    <a:xfrm>
+                      <a:off x="0" y="0"/>
+                      <a:ext cx="5943600" cy="1880886"/>
+                    </a:xfrm>
+                    <a:prstGeom prst="rect">
+                      <a:avLst/>
+                    </a:prstGeom>
+                    <a:noFill/>
+                    <a:ln w="9525">
+                      <a:noFill/>
+                      <a:headEnd/>
+                      <a:tailEnd/>
+                    </a:ln>
+                  </pic:spPr>
+                </pic:pic>
+              </a:graphicData>
+            </a:graphic>
+          </wp:inline>
+        </w:drawing>
+      </w:r>
+    </w:p>
+    <w:p>
+      <w:pPr>
+        <w:pStyle w:val="ImageCaption"/>
+      </w:pPr>
+      <w:r>
+        <w:t xml:space="preserve">Escritorio: menú Reportes del administrador</w:t>
+      </w:r>
+    </w:p>
+    <w:p>
+      <w:pPr>
+        <w:pStyle w:val="CaptionedFigure"/>
+      </w:pPr>
+      <w:r>
+        <w:drawing>
+          <wp:inline>
+            <wp:extent cx="5943600" cy="2518474"/>
+            <wp:effectExtent b="0" l="0" r="0" t="0"/>
+            <wp:docPr descr="Escritorio: menú del dueño (solo Perros y Paseos)" title="" id="1006" name="Picture"/>
+            <a:graphic>
+              <a:graphicData uri="http://schemas.openxmlformats.org/drawingml/2006/picture">
+                <pic:pic>
+                  <pic:nvPicPr>
+                    <pic:cNvPr descr="capturas/esc-menu-dueno.png" id="1007" name="Picture"/>
+                    <pic:cNvPicPr>
+                      <a:picLocks noChangeArrowheads="1" noChangeAspect="1"/>
+                    </pic:cNvPicPr>
+                  </pic:nvPicPr>
+                  <pic:blipFill>
+                    <a:blip r:embed="rIdCap7"/>
+                    <a:stretch>
+                      <a:fillRect/>
+                    </a:stretch>
+                  </pic:blipFill>
+                  <pic:spPr bwMode="auto">
+                    <a:xfrm>
+                      <a:off x="0" y="0"/>
+                      <a:ext cx="5943600" cy="2518474"/>
+                    </a:xfrm>
+                    <a:prstGeom prst="rect">
+                      <a:avLst/>
+                    </a:prstGeom>
+                    <a:noFill/>
+                    <a:ln w="9525">
+                      <a:noFill/>
+                      <a:headEnd/>
+                      <a:tailEnd/>
+                    </a:ln>
+                  </pic:spPr>
+                </pic:pic>
+              </a:graphicData>
+            </a:graphic>
+          </wp:inline>
+        </w:drawing>
+      </w:r>
+    </w:p>
+    <w:p>
+      <w:pPr>
+        <w:pStyle w:val="ImageCaption"/>
+      </w:pPr>
+      <w:r>
+        <w:t xml:space="preserve">Escritorio: menú del dueño (solo Perros y Paseos)</w:t>
+      </w:r>
+    </w:p>
+    <w:p>
+      <w:pPr>
+        <w:pStyle w:val="CaptionedFigure"/>
+      </w:pPr>
+      <w:r>
+        <w:drawing>
+          <wp:inline>
+            <wp:extent cx="5943600" cy="2518474"/>
+            <wp:effectExtent b="0" l="0" r="0" t="0"/>
+            <wp:docPr descr="Escritorio: menú del paseador (solo Paseos)" title="" id="1008" name="Picture"/>
+            <a:graphic>
+              <a:graphicData uri="http://schemas.openxmlformats.org/drawingml/2006/picture">
+                <pic:pic>
+                  <pic:nvPicPr>
+                    <pic:cNvPr descr="capturas/esc-menu-paseador.png" id="1009" name="Picture"/>
+                    <pic:cNvPicPr>
+                      <a:picLocks noChangeArrowheads="1" noChangeAspect="1"/>
+                    </pic:cNvPicPr>
+                  </pic:nvPicPr>
+                  <pic:blipFill>
+                    <a:blip r:embed="rIdCap9"/>
+                    <a:stretch>
+                      <a:fillRect/>
+                    </a:stretch>
+                  </pic:blipFill>
+                  <pic:spPr bwMode="auto">
+                    <a:xfrm>
+                      <a:off x="0" y="0"/>
+                      <a:ext cx="5943600" cy="2518474"/>
+                    </a:xfrm>
+                    <a:prstGeom prst="rect">
+                      <a:avLst/>
+                    </a:prstGeom>
+                    <a:noFill/>
+                    <a:ln w="9525">
+                      <a:noFill/>
+                      <a:headEnd/>
+                      <a:tailEnd/>
+                    </a:ln>
+                  </pic:spPr>
+                </pic:pic>
+              </a:graphicData>
+            </a:graphic>
+          </wp:inline>
+        </w:drawing>
+      </w:r>
+    </w:p>
+    <w:p>
+      <w:pPr>
+        <w:pStyle w:val="ImageCaption"/>
+      </w:pPr>
+      <w:r>
+        <w:t xml:space="preserve">Escritorio: menú del paseador (solo Paseos)</w:t>
+      </w:r>
+    </w:p>
+    <w:p>
+      <w:pPr>
+        <w:pStyle w:val="CaptionedFigure"/>
+      </w:pPr>
+      <w:r>
+        <w:drawing>
+          <wp:inline>
+            <wp:extent cx="5943600" cy="4246065"/>
+            <wp:effectExtent b="0" l="0" r="0" t="0"/>
+            <wp:docPr descr="Escritorio: ABMC de dueños" title="" id="1010" name="Picture"/>
+            <a:graphic>
+              <a:graphicData uri="http://schemas.openxmlformats.org/drawingml/2006/picture">
+                <pic:pic>
+                  <pic:nvPicPr>
+                    <pic:cNvPr descr="capturas/esc-duenos-admin.png" id="1011" name="Picture"/>
+                    <pic:cNvPicPr>
+                      <a:picLocks noChangeArrowheads="1" noChangeAspect="1"/>
+                    </pic:cNvPicPr>
+                  </pic:nvPicPr>
+                  <pic:blipFill>
+                    <a:blip r:embed="rIdCap11"/>
+                    <a:stretch>
+                      <a:fillRect/>
+                    </a:stretch>
+                  </pic:blipFill>
+                  <pic:spPr bwMode="auto">
+                    <a:xfrm>
+                      <a:off x="0" y="0"/>
+                      <a:ext cx="5943600" cy="4246065"/>
+                    </a:xfrm>
+                    <a:prstGeom prst="rect">
+                      <a:avLst/>
+                    </a:prstGeom>
+                    <a:noFill/>
+                    <a:ln w="9525">
+                      <a:noFill/>
+                      <a:headEnd/>
+                      <a:tailEnd/>
+                    </a:ln>
+                  </pic:spPr>
+                </pic:pic>
+              </a:graphicData>
+            </a:graphic>
+          </wp:inline>
+        </w:drawing>
+      </w:r>
+    </w:p>
+    <w:p>
+      <w:pPr>
+        <w:pStyle w:val="ImageCaption"/>
+      </w:pPr>
+      <w:r>
+        <w:t xml:space="preserve">Escritorio: ABMC de dueños</w:t>
+      </w:r>
+    </w:p>
+    <w:p>
+      <w:pPr>
+        <w:pStyle w:val="CaptionedFigure"/>
+      </w:pPr>
+      <w:r>
+        <w:drawing>
+          <wp:inline>
+            <wp:extent cx="5943600" cy="4758444"/>
+            <wp:effectExtent b="0" l="0" r="0" t="0"/>
+            <wp:docPr descr="Escritorio: ABMC de paseadores" title="" id="1012" name="Picture"/>
+            <a:graphic>
+              <a:graphicData uri="http://schemas.openxmlformats.org/drawingml/2006/picture">
+                <pic:pic>
+                  <pic:nvPicPr>
+                    <pic:cNvPr descr="capturas/esc-paseadores-admin.png" id="1013" name="Picture"/>
+                    <pic:cNvPicPr>
+                      <a:picLocks noChangeArrowheads="1" noChangeAspect="1"/>
+                    </pic:cNvPicPr>
+                  </pic:nvPicPr>
+                  <pic:blipFill>
+                    <a:blip r:embed="rIdCap13"/>
+                    <a:stretch>
+                      <a:fillRect/>
+                    </a:stretch>
+                  </pic:blipFill>
+                  <pic:spPr bwMode="auto">
+                    <a:xfrm>
+                      <a:off x="0" y="0"/>
+                      <a:ext cx="5943600" cy="4758444"/>
+                    </a:xfrm>
+                    <a:prstGeom prst="rect">
+                      <a:avLst/>
+                    </a:prstGeom>
+                    <a:noFill/>
+                    <a:ln w="9525">
+                      <a:noFill/>
+                      <a:headEnd/>
+                      <a:tailEnd/>
+                    </a:ln>
+                  </pic:spPr>
+                </pic:pic>
+              </a:graphicData>
+            </a:graphic>
+          </wp:inline>
+        </w:drawing>
+      </w:r>
+    </w:p>
+    <w:p>
+      <w:pPr>
+        <w:pStyle w:val="ImageCaption"/>
+      </w:pPr>
+      <w:r>
+        <w:t xml:space="preserve">Escritorio: ABMC de paseadores</w:t>
+      </w:r>
+    </w:p>
+    <w:p>
+      <w:pPr>
+        <w:pStyle w:val="CaptionedFigure"/>
+      </w:pPr>
+      <w:r>
+        <w:drawing>
+          <wp:inline>
+            <wp:extent cx="5943600" cy="3978736"/>
+            <wp:effectExtent b="0" l="0" r="0" t="0"/>
+            <wp:docPr descr="Escritorio: ABMC de perros (administrador)" title="" id="1014" name="Picture"/>
+            <a:graphic>
+              <a:graphicData uri="http://schemas.openxmlformats.org/drawingml/2006/picture">
+                <pic:pic>
+                  <pic:nvPicPr>
+                    <pic:cNvPr descr="capturas/esc-perros-admin.png" id="1015" name="Picture"/>
+                    <pic:cNvPicPr>
+                      <a:picLocks noChangeArrowheads="1" noChangeAspect="1"/>
+                    </pic:cNvPicPr>
+                  </pic:nvPicPr>
+                  <pic:blipFill>
+                    <a:blip r:embed="rIdCap15"/>
+                    <a:stretch>
+                      <a:fillRect/>
+                    </a:stretch>
+                  </pic:blipFill>
+                  <pic:spPr bwMode="auto">
+                    <a:xfrm>
+                      <a:off x="0" y="0"/>
+                      <a:ext cx="5943600" cy="3978736"/>
+                    </a:xfrm>
+                    <a:prstGeom prst="rect">
+                      <a:avLst/>
+                    </a:prstGeom>
+                    <a:noFill/>
+                    <a:ln w="9525">
+                      <a:noFill/>
+                      <a:headEnd/>
+                      <a:tailEnd/>
+                    </a:ln>
+                  </pic:spPr>
+                </pic:pic>
+              </a:graphicData>
+            </a:graphic>
+          </wp:inline>
+        </w:drawing>
+      </w:r>
+    </w:p>
+    <w:p>
+      <w:pPr>
+        <w:pStyle w:val="ImageCaption"/>
+      </w:pPr>
+      <w:r>
+        <w:t xml:space="preserve">Escritorio: ABMC de perros (administrador)</w:t>
+      </w:r>
+    </w:p>
+    <w:p>
+      <w:pPr>
+        <w:pStyle w:val="CaptionedFigure"/>
+      </w:pPr>
+      <w:r>
+        <w:drawing>
+          <wp:inline>
+            <wp:extent cx="5943600" cy="3978736"/>
+            <wp:effectExtent b="0" l="0" r="0" t="0"/>
+            <wp:docPr descr="Escritorio: perros vistos por un dueño (solo los suyos, con el dueño fijo)" title="" id="1016" name="Picture"/>
+            <a:graphic>
+              <a:graphicData uri="http://schemas.openxmlformats.org/drawingml/2006/picture">
+                <pic:pic>
+                  <pic:nvPicPr>
+                    <pic:cNvPr descr="capturas/esc-perros-dueno.png" id="1017" name="Picture"/>
+                    <pic:cNvPicPr>
+                      <a:picLocks noChangeArrowheads="1" noChangeAspect="1"/>
+                    </pic:cNvPicPr>
+                  </pic:nvPicPr>
+                  <pic:blipFill>
+                    <a:blip r:embed="rIdCap17"/>
+                    <a:stretch>
+                      <a:fillRect/>
+                    </a:stretch>
+                  </pic:blipFill>
+                  <pic:spPr bwMode="auto">
+                    <a:xfrm>
+                      <a:off x="0" y="0"/>
+                      <a:ext cx="5943600" cy="3978736"/>
+                    </a:xfrm>
+                    <a:prstGeom prst="rect">
+                      <a:avLst/>
+                    </a:prstGeom>
+                    <a:noFill/>
+                    <a:ln w="9525">
+                      <a:noFill/>
+                      <a:headEnd/>
+                      <a:tailEnd/>
+                    </a:ln>
+                  </pic:spPr>
+                </pic:pic>
+              </a:graphicData>
+            </a:graphic>
+          </wp:inline>
+        </w:drawing>
+      </w:r>
+    </w:p>
+    <w:p>
+      <w:pPr>
+        <w:pStyle w:val="ImageCaption"/>
+      </w:pPr>
+      <w:r>
+        <w:t xml:space="preserve">Escritorio: perros vistos por un dueño (solo los suyos, con el dueño fijo)</w:t>
+      </w:r>
+    </w:p>
+    <w:p>
+      <w:pPr>
+        <w:pStyle w:val="CaptionedFigure"/>
+      </w:pPr>
+      <w:r>
+        <w:drawing>
+          <wp:inline>
+            <wp:extent cx="5943600" cy="3978736"/>
+            <wp:effectExtent b="0" l="0" r="0" t="0"/>
+            <wp:docPr descr="Escritorio: ABMC de paseos (administrador)" title="" id="1018" name="Picture"/>
+            <a:graphic>
+              <a:graphicData uri="http://schemas.openxmlformats.org/drawingml/2006/picture">
+                <pic:pic>
+                  <pic:nvPicPr>
+                    <pic:cNvPr descr="capturas/esc-paseos-admin.png" id="1019" name="Picture"/>
+                    <pic:cNvPicPr>
+                      <a:picLocks noChangeArrowheads="1" noChangeAspect="1"/>
+                    </pic:cNvPicPr>
+                  </pic:nvPicPr>
+                  <pic:blipFill>
+                    <a:blip r:embed="rIdCap19"/>
+                    <a:stretch>
+                      <a:fillRect/>
+                    </a:stretch>
+                  </pic:blipFill>
+                  <pic:spPr bwMode="auto">
+                    <a:xfrm>
+                      <a:off x="0" y="0"/>
+                      <a:ext cx="5943600" cy="3978736"/>
+                    </a:xfrm>
+                    <a:prstGeom prst="rect">
+                      <a:avLst/>
+                    </a:prstGeom>
+                    <a:noFill/>
+                    <a:ln w="9525">
+                      <a:noFill/>
+                      <a:headEnd/>
+                      <a:tailEnd/>
+                    </a:ln>
+                  </pic:spPr>
+                </pic:pic>
+              </a:graphicData>
+            </a:graphic>
+          </wp:inline>
+        </w:drawing>
+      </w:r>
+    </w:p>
+    <w:p>
+      <w:pPr>
+        <w:pStyle w:val="ImageCaption"/>
+      </w:pPr>
+      <w:r>
+        <w:t xml:space="preserve">Escritorio: ABMC de paseos (administrador)</w:t>
+      </w:r>
+    </w:p>
+    <w:p>
+      <w:pPr>
+        <w:pStyle w:val="CaptionedFigure"/>
+      </w:pPr>
+      <w:r>
+        <w:drawing>
+          <wp:inline>
+            <wp:extent cx="5943600" cy="3978736"/>
+            <wp:effectExtent b="0" l="0" r="0" t="0"/>
+            <wp:docPr descr="Escritorio: búsqueda de paseos filtrando por paseador y rango de fechas" title="" id="1020" name="Picture"/>
+            <a:graphic>
+              <a:graphicData uri="http://schemas.openxmlformats.org/drawingml/2006/picture">
+                <pic:pic>
+                  <pic:nvPicPr>
+                    <pic:cNvPr descr="capturas/esc-paseos-admin-filtro.png" id="1021" name="Picture"/>
+                    <pic:cNvPicPr>
+                      <a:picLocks noChangeArrowheads="1" noChangeAspect="1"/>
+                    </pic:cNvPicPr>
+                  </pic:nvPicPr>
+                  <pic:blipFill>
+                    <a:blip r:embed="rIdCap21"/>
+                    <a:stretch>
+                      <a:fillRect/>
+                    </a:stretch>
+                  </pic:blipFill>
+                  <pic:spPr bwMode="auto">
+                    <a:xfrm>
+                      <a:off x="0" y="0"/>
+                      <a:ext cx="5943600" cy="3978736"/>
+                    </a:xfrm>
+                    <a:prstGeom prst="rect">
+                      <a:avLst/>
+                    </a:prstGeom>
+                    <a:noFill/>
+                    <a:ln w="9525">
+                      <a:noFill/>
+                      <a:headEnd/>
+                      <a:tailEnd/>
+                    </a:ln>
+                  </pic:spPr>
+                </pic:pic>
+              </a:graphicData>
+            </a:graphic>
+          </wp:inline>
+        </w:drawing>
+      </w:r>
+    </w:p>
+    <w:p>
+      <w:pPr>
+        <w:pStyle w:val="ImageCaption"/>
+      </w:pPr>
+      <w:r>
+        <w:t xml:space="preserve">Escritorio: búsqueda de paseos filtrando por paseador y rango de fechas</w:t>
+      </w:r>
+    </w:p>
+    <w:p>
+      <w:pPr>
+        <w:pStyle w:val="CaptionedFigure"/>
+      </w:pPr>
+      <w:r>
+        <w:drawing>
+          <wp:inline>
+            <wp:extent cx="5943600" cy="3978736"/>
+            <wp:effectExtent b="0" l="0" r="0" t="0"/>
+            <wp:docPr descr="Escritorio: paseos vistos por un dueño (solo los de sus perros)" title="" id="1022" name="Picture"/>
+            <a:graphic>
+              <a:graphicData uri="http://schemas.openxmlformats.org/drawingml/2006/picture">
+                <pic:pic>
+                  <pic:nvPicPr>
+                    <pic:cNvPr descr="capturas/esc-paseos-dueno.png" id="1023" name="Picture"/>
+                    <pic:cNvPicPr>
+                      <a:picLocks noChangeArrowheads="1" noChangeAspect="1"/>
+                    </pic:cNvPicPr>
+                  </pic:nvPicPr>
+                  <pic:blipFill>
+                    <a:blip r:embed="rIdCap23"/>
+                    <a:stretch>
+                      <a:fillRect/>
+                    </a:stretch>
+                  </pic:blipFill>
+                  <pic:spPr bwMode="auto">
+                    <a:xfrm>
+                      <a:off x="0" y="0"/>
+                      <a:ext cx="5943600" cy="3978736"/>
+                    </a:xfrm>
+                    <a:prstGeom prst="rect">
+                      <a:avLst/>
+                    </a:prstGeom>
+                    <a:noFill/>
+                    <a:ln w="9525">
+                      <a:noFill/>
+                      <a:headEnd/>
+                      <a:tailEnd/>
+                    </a:ln>
+                  </pic:spPr>
+                </pic:pic>
+              </a:graphicData>
+            </a:graphic>
+          </wp:inline>
+        </w:drawing>
+      </w:r>
+    </w:p>
+    <w:p>
+      <w:pPr>
+        <w:pStyle w:val="ImageCaption"/>
+      </w:pPr>
+      <w:r>
+        <w:t xml:space="preserve">Escritorio: paseos vistos por un dueño (solo los de sus perros)</w:t>
+      </w:r>
+    </w:p>
+    <w:p>
+      <w:pPr>
+        <w:pStyle w:val="CaptionedFigure"/>
+      </w:pPr>
+      <w:r>
+        <w:drawing>
+          <wp:inline>
+            <wp:extent cx="5943600" cy="3978736"/>
+            <wp:effectExtent b="0" l="0" r="0" t="0"/>
+            <wp:docPr descr="Escritorio: paseos vistos por un paseador (solo los suyos)" title="" id="1024" name="Picture"/>
+            <a:graphic>
+              <a:graphicData uri="http://schemas.openxmlformats.org/drawingml/2006/picture">
+                <pic:pic>
+                  <pic:nvPicPr>
+                    <pic:cNvPr descr="capturas/esc-paseos-paseador.png" id="1025" name="Picture"/>
+                    <pic:cNvPicPr>
+                      <a:picLocks noChangeArrowheads="1" noChangeAspect="1"/>
+                    </pic:cNvPicPr>
+                  </pic:nvPicPr>
+                  <pic:blipFill>
+                    <a:blip r:embed="rIdCap25"/>
+                    <a:stretch>
+                      <a:fillRect/>
+                    </a:stretch>
+                  </pic:blipFill>
+                  <pic:spPr bwMode="auto">
+                    <a:xfrm>
+                      <a:off x="0" y="0"/>
+                      <a:ext cx="5943600" cy="3978736"/>
+                    </a:xfrm>
+                    <a:prstGeom prst="rect">
+                      <a:avLst/>
+                    </a:prstGeom>
+                    <a:noFill/>
+                    <a:ln w="9525">
+                      <a:noFill/>
+                      <a:headEnd/>
+                      <a:tailEnd/>
+                    </a:ln>
+                  </pic:spPr>
+                </pic:pic>
+              </a:graphicData>
+            </a:graphic>
+          </wp:inline>
+        </w:drawing>
+      </w:r>
+    </w:p>
+    <w:p>
+      <w:pPr>
+        <w:pStyle w:val="ImageCaption"/>
+      </w:pPr>
+      <w:r>
+        <w:t xml:space="preserve">Escritorio: paseos vistos por un paseador (solo los suyos)</w:t>
+      </w:r>
+    </w:p>
+    <w:p>
+      <w:pPr>
+        <w:pStyle w:val="CaptionedFigure"/>
+      </w:pPr>
+      <w:r>
+        <w:drawing>
+          <wp:inline>
+            <wp:extent cx="5943600" cy="4246065"/>
+            <wp:effectExtent b="0" l="0" r="0" t="0"/>
+            <wp:docPr descr="Escritorio: ABMC de administradores" title="" id="1026" name="Picture"/>
+            <a:graphic>
+              <a:graphicData uri="http://schemas.openxmlformats.org/drawingml/2006/picture">
+                <pic:pic>
+                  <pic:nvPicPr>
+                    <pic:cNvPr descr="capturas/esc-administradores-admin.png" id="1027" name="Picture"/>
+                    <pic:cNvPicPr>
+                      <a:picLocks noChangeArrowheads="1" noChangeAspect="1"/>
+                    </pic:cNvPicPr>
+                  </pic:nvPicPr>
+                  <pic:blipFill>
+                    <a:blip r:embed="rIdCap27"/>
+                    <a:stretch>
+                      <a:fillRect/>
+                    </a:stretch>
+                  </pic:blipFill>
+                  <pic:spPr bwMode="auto">
+                    <a:xfrm>
+                      <a:off x="0" y="0"/>
+                      <a:ext cx="5943600" cy="4246065"/>
+                    </a:xfrm>
+                    <a:prstGeom prst="rect">
+                      <a:avLst/>
+                    </a:prstGeom>
+                    <a:noFill/>
+                    <a:ln w="9525">
+                      <a:noFill/>
+                      <a:headEnd/>
+                      <a:tailEnd/>
+                    </a:ln>
+                  </pic:spPr>
+                </pic:pic>
+              </a:graphicData>
+            </a:graphic>
+          </wp:inline>
+        </w:drawing>
+      </w:r>
+    </w:p>
+    <w:p>
+      <w:pPr>
+        <w:pStyle w:val="ImageCaption"/>
+      </w:pPr>
+      <w:r>
+        <w:t xml:space="preserve">Escritorio: ABMC de administradores</w:t>
+      </w:r>
+    </w:p>
+    <w:p>
+      <w:pPr>
+        <w:pStyle w:val="CaptionedFigure"/>
+      </w:pPr>
+      <w:r>
+        <w:drawing>
+          <wp:inline>
+            <wp:extent cx="5943600" cy="5002384"/>
+            <wp:effectExtent b="0" l="0" r="0" t="0"/>
+            <wp:docPr descr="Escritorio: liquidaciones registradas (maestro)" title="" id="1028" name="Picture"/>
+            <a:graphic>
+              <a:graphicData uri="http://schemas.openxmlformats.org/drawingml/2006/picture">
+                <pic:pic>
+                  <pic:nvPicPr>
+                    <pic:cNvPr descr="capturas/esc-liquidaciones-lista.png" id="1029" name="Picture"/>
+                    <pic:cNvPicPr>
+                      <a:picLocks noChangeArrowheads="1" noChangeAspect="1"/>
+                    </pic:cNvPicPr>
+                  </pic:nvPicPr>
+                  <pic:blipFill>
+                    <a:blip r:embed="rIdCap29"/>
+                    <a:stretch>
+                      <a:fillRect/>
+                    </a:stretch>
+                  </pic:blipFill>
+                  <pic:spPr bwMode="auto">
+                    <a:xfrm>
+                      <a:off x="0" y="0"/>
+                      <a:ext cx="5943600" cy="5002384"/>
+                    </a:xfrm>
+                    <a:prstGeom prst="rect">
+                      <a:avLst/>
+                    </a:prstGeom>
+                    <a:noFill/>
+                    <a:ln w="9525">
+                      <a:noFill/>
+                      <a:headEnd/>
+                      <a:tailEnd/>
+                    </a:ln>
+                  </pic:spPr>
+                </pic:pic>
+              </a:graphicData>
+            </a:graphic>
+          </wp:inline>
+        </w:drawing>
+      </w:r>
+    </w:p>
+    <w:p>
+      <w:pPr>
+        <w:pStyle w:val="ImageCaption"/>
+      </w:pPr>
+      <w:r>
+        <w:t xml:space="preserve">Escritorio: liquidaciones registradas (maestro)</w:t>
+      </w:r>
+    </w:p>
+    <w:p>
+      <w:pPr>
+        <w:pStyle w:val="CaptionedFigure"/>
+      </w:pPr>
+      <w:r>
+        <w:drawing>
+          <wp:inline>
+            <wp:extent cx="5943600" cy="5002384"/>
+            <wp:effectExtent b="0" l="0" r="0" t="0"/>
+            <wp:docPr descr="Escritorio: edición de una liquidación (cabecera, paseos pendientes y detalle con el total)" title="" id="1030" name="Picture"/>
+            <a:graphic>
+              <a:graphicData uri="http://schemas.openxmlformats.org/drawingml/2006/picture">
+                <pic:pic>
+                  <pic:nvPicPr>
+                    <pic:cNvPr descr="capturas/esc-liquidaciones-detalle.png" id="1031" name="Picture"/>
+                    <pic:cNvPicPr>
+                      <a:picLocks noChangeArrowheads="1" noChangeAspect="1"/>
+                    </pic:cNvPicPr>
+                  </pic:nvPicPr>
+                  <pic:blipFill>
+                    <a:blip r:embed="rIdCap31"/>
+                    <a:stretch>
+                      <a:fillRect/>
+                    </a:stretch>
+                  </pic:blipFill>
+                  <pic:spPr bwMode="auto">
+                    <a:xfrm>
+                      <a:off x="0" y="0"/>
+                      <a:ext cx="5943600" cy="5002384"/>
+                    </a:xfrm>
+                    <a:prstGeom prst="rect">
+                      <a:avLst/>
+                    </a:prstGeom>
+                    <a:noFill/>
+                    <a:ln w="9525">
+                      <a:noFill/>
+                      <a:headEnd/>
+                      <a:tailEnd/>
+                    </a:ln>
+                  </pic:spPr>
+                </pic:pic>
+              </a:graphicData>
+            </a:graphic>
+          </wp:inline>
+        </w:drawing>
+      </w:r>
+    </w:p>
+    <w:p>
+      <w:pPr>
+        <w:pStyle w:val="ImageCaption"/>
+      </w:pPr>
+      <w:r>
+        <w:t xml:space="preserve">Escritorio: edición de una liquidación (cabecera, paseos pendientes y detalle con el total)</w:t>
       </w:r>
     </w:p>
     <w:bookmarkEnd w:id="17"/>
@@ -2235,13 +3109,777 @@
         <w:pStyle w:val="FirstParagraph"/>
       </w:pPr>
       <w:r>
-        <w:t xml:space="preserve">[COMPLETAR: login, menú por rol, Dueños, Paseadores, Perros, Paseos (con filtros),</w:t>
-      </w:r>
-      <w:r>
-        <w:t xml:space="preserve"> </w:t>
-      </w:r>
-      <w:r>
-        <w:t xml:space="preserve">Administradores y Liquidaciones.]</w:t>
+        <w:t xml:space="preserve">La barra lateral muestra solo las páginas que el rol puede usar; las páginas solo para el administrador redirigen al inicio si otro rol entra por URL.</w:t>
+      </w:r>
+    </w:p>
+    <w:p>
+      <w:pPr>
+        <w:pStyle w:val="CaptionedFigure"/>
+      </w:pPr>
+      <w:r>
+        <w:drawing>
+          <wp:inline>
+            <wp:extent cx="3200400" cy="1973580"/>
+            <wp:effectExtent b="0" l="0" r="0" t="0"/>
+            <wp:docPr descr="Web: inicio de sesión" title="" id="1032" name="Picture"/>
+            <a:graphic>
+              <a:graphicData uri="http://schemas.openxmlformats.org/drawingml/2006/picture">
+                <pic:pic>
+                  <pic:nvPicPr>
+                    <pic:cNvPr descr="capturas/web-01-login.png" id="1033" name="Picture"/>
+                    <pic:cNvPicPr>
+                      <a:picLocks noChangeArrowheads="1" noChangeAspect="1"/>
+                    </pic:cNvPicPr>
+                  </pic:nvPicPr>
+                  <pic:blipFill>
+                    <a:blip r:embed="rIdCap33"/>
+                    <a:stretch>
+                      <a:fillRect/>
+                    </a:stretch>
+                  </pic:blipFill>
+                  <pic:spPr bwMode="auto">
+                    <a:xfrm>
+                      <a:off x="0" y="0"/>
+                      <a:ext cx="3200400" cy="1973580"/>
+                    </a:xfrm>
+                    <a:prstGeom prst="rect">
+                      <a:avLst/>
+                    </a:prstGeom>
+                    <a:noFill/>
+                    <a:ln w="9525">
+                      <a:noFill/>
+                      <a:headEnd/>
+                      <a:tailEnd/>
+                    </a:ln>
+                  </pic:spPr>
+                </pic:pic>
+              </a:graphicData>
+            </a:graphic>
+          </wp:inline>
+        </w:drawing>
+      </w:r>
+    </w:p>
+    <w:p>
+      <w:pPr>
+        <w:pStyle w:val="ImageCaption"/>
+      </w:pPr>
+      <w:r>
+        <w:t xml:space="preserve">Web: inicio de sesión</w:t>
+      </w:r>
+    </w:p>
+    <w:p>
+      <w:pPr>
+        <w:pStyle w:val="CaptionedFigure"/>
+      </w:pPr>
+      <w:r>
+        <w:drawing>
+          <wp:inline>
+            <wp:extent cx="5943600" cy="4127500"/>
+            <wp:effectExtent b="0" l="0" r="0" t="0"/>
+            <wp:docPr descr="Web: menú del administrador" title="" id="1034" name="Picture"/>
+            <a:graphic>
+              <a:graphicData uri="http://schemas.openxmlformats.org/drawingml/2006/picture">
+                <pic:pic>
+                  <pic:nvPicPr>
+                    <pic:cNvPr descr="capturas/web-inicio-admin.png" id="1035" name="Picture"/>
+                    <pic:cNvPicPr>
+                      <a:picLocks noChangeArrowheads="1" noChangeAspect="1"/>
+                    </pic:cNvPicPr>
+                  </pic:nvPicPr>
+                  <pic:blipFill>
+                    <a:blip r:embed="rIdCap35"/>
+                    <a:stretch>
+                      <a:fillRect/>
+                    </a:stretch>
+                  </pic:blipFill>
+                  <pic:spPr bwMode="auto">
+                    <a:xfrm>
+                      <a:off x="0" y="0"/>
+                      <a:ext cx="5943600" cy="4127500"/>
+                    </a:xfrm>
+                    <a:prstGeom prst="rect">
+                      <a:avLst/>
+                    </a:prstGeom>
+                    <a:noFill/>
+                    <a:ln w="9525">
+                      <a:noFill/>
+                      <a:headEnd/>
+                      <a:tailEnd/>
+                    </a:ln>
+                  </pic:spPr>
+                </pic:pic>
+              </a:graphicData>
+            </a:graphic>
+          </wp:inline>
+        </w:drawing>
+      </w:r>
+    </w:p>
+    <w:p>
+      <w:pPr>
+        <w:pStyle w:val="ImageCaption"/>
+      </w:pPr>
+      <w:r>
+        <w:t xml:space="preserve">Web: menú del administrador</w:t>
+      </w:r>
+    </w:p>
+    <w:p>
+      <w:pPr>
+        <w:pStyle w:val="CaptionedFigure"/>
+      </w:pPr>
+      <w:r>
+        <w:drawing>
+          <wp:inline>
+            <wp:extent cx="5943600" cy="4127500"/>
+            <wp:effectExtent b="0" l="0" r="0" t="0"/>
+            <wp:docPr descr="Web: menú del dueño" title="" id="1036" name="Picture"/>
+            <a:graphic>
+              <a:graphicData uri="http://schemas.openxmlformats.org/drawingml/2006/picture">
+                <pic:pic>
+                  <pic:nvPicPr>
+                    <pic:cNvPr descr="capturas/web-inicio-dueno.png" id="1037" name="Picture"/>
+                    <pic:cNvPicPr>
+                      <a:picLocks noChangeArrowheads="1" noChangeAspect="1"/>
+                    </pic:cNvPicPr>
+                  </pic:nvPicPr>
+                  <pic:blipFill>
+                    <a:blip r:embed="rIdCap37"/>
+                    <a:stretch>
+                      <a:fillRect/>
+                    </a:stretch>
+                  </pic:blipFill>
+                  <pic:spPr bwMode="auto">
+                    <a:xfrm>
+                      <a:off x="0" y="0"/>
+                      <a:ext cx="5943600" cy="4127500"/>
+                    </a:xfrm>
+                    <a:prstGeom prst="rect">
+                      <a:avLst/>
+                    </a:prstGeom>
+                    <a:noFill/>
+                    <a:ln w="9525">
+                      <a:noFill/>
+                      <a:headEnd/>
+                      <a:tailEnd/>
+                    </a:ln>
+                  </pic:spPr>
+                </pic:pic>
+              </a:graphicData>
+            </a:graphic>
+          </wp:inline>
+        </w:drawing>
+      </w:r>
+    </w:p>
+    <w:p>
+      <w:pPr>
+        <w:pStyle w:val="ImageCaption"/>
+      </w:pPr>
+      <w:r>
+        <w:t xml:space="preserve">Web: menú del dueño</w:t>
+      </w:r>
+    </w:p>
+    <w:p>
+      <w:pPr>
+        <w:pStyle w:val="CaptionedFigure"/>
+      </w:pPr>
+      <w:r>
+        <w:drawing>
+          <wp:inline>
+            <wp:extent cx="5943600" cy="4127500"/>
+            <wp:effectExtent b="0" l="0" r="0" t="0"/>
+            <wp:docPr descr="Web: menú del paseador" title="" id="1038" name="Picture"/>
+            <a:graphic>
+              <a:graphicData uri="http://schemas.openxmlformats.org/drawingml/2006/picture">
+                <pic:pic>
+                  <pic:nvPicPr>
+                    <pic:cNvPr descr="capturas/web-inicio-paseador.png" id="1039" name="Picture"/>
+                    <pic:cNvPicPr>
+                      <a:picLocks noChangeArrowheads="1" noChangeAspect="1"/>
+                    </pic:cNvPicPr>
+                  </pic:nvPicPr>
+                  <pic:blipFill>
+                    <a:blip r:embed="rIdCap39"/>
+                    <a:stretch>
+                      <a:fillRect/>
+                    </a:stretch>
+                  </pic:blipFill>
+                  <pic:spPr bwMode="auto">
+                    <a:xfrm>
+                      <a:off x="0" y="0"/>
+                      <a:ext cx="5943600" cy="4127500"/>
+                    </a:xfrm>
+                    <a:prstGeom prst="rect">
+                      <a:avLst/>
+                    </a:prstGeom>
+                    <a:noFill/>
+                    <a:ln w="9525">
+                      <a:noFill/>
+                      <a:headEnd/>
+                      <a:tailEnd/>
+                    </a:ln>
+                  </pic:spPr>
+                </pic:pic>
+              </a:graphicData>
+            </a:graphic>
+          </wp:inline>
+        </w:drawing>
+      </w:r>
+    </w:p>
+    <w:p>
+      <w:pPr>
+        <w:pStyle w:val="ImageCaption"/>
+      </w:pPr>
+      <w:r>
+        <w:t xml:space="preserve">Web: menú del paseador</w:t>
+      </w:r>
+    </w:p>
+    <w:p>
+      <w:pPr>
+        <w:pStyle w:val="CaptionedFigure"/>
+      </w:pPr>
+      <w:r>
+        <w:drawing>
+          <wp:inline>
+            <wp:extent cx="5943600" cy="4127500"/>
+            <wp:effectExtent b="0" l="0" r="0" t="0"/>
+            <wp:docPr descr="Web: ABMC de dueños" title="" id="1040" name="Picture"/>
+            <a:graphic>
+              <a:graphicData uri="http://schemas.openxmlformats.org/drawingml/2006/picture">
+                <pic:pic>
+                  <pic:nvPicPr>
+                    <pic:cNvPr descr="capturas/web-duenos-admin.png" id="1041" name="Picture"/>
+                    <pic:cNvPicPr>
+                      <a:picLocks noChangeArrowheads="1" noChangeAspect="1"/>
+                    </pic:cNvPicPr>
+                  </pic:nvPicPr>
+                  <pic:blipFill>
+                    <a:blip r:embed="rIdCap41"/>
+                    <a:stretch>
+                      <a:fillRect/>
+                    </a:stretch>
+                  </pic:blipFill>
+                  <pic:spPr bwMode="auto">
+                    <a:xfrm>
+                      <a:off x="0" y="0"/>
+                      <a:ext cx="5943600" cy="4127500"/>
+                    </a:xfrm>
+                    <a:prstGeom prst="rect">
+                      <a:avLst/>
+                    </a:prstGeom>
+                    <a:noFill/>
+                    <a:ln w="9525">
+                      <a:noFill/>
+                      <a:headEnd/>
+                      <a:tailEnd/>
+                    </a:ln>
+                  </pic:spPr>
+                </pic:pic>
+              </a:graphicData>
+            </a:graphic>
+          </wp:inline>
+        </w:drawing>
+      </w:r>
+    </w:p>
+    <w:p>
+      <w:pPr>
+        <w:pStyle w:val="ImageCaption"/>
+      </w:pPr>
+      <w:r>
+        <w:t xml:space="preserve">Web: ABMC de dueños</w:t>
+      </w:r>
+    </w:p>
+    <w:p>
+      <w:pPr>
+        <w:pStyle w:val="CaptionedFigure"/>
+      </w:pPr>
+      <w:r>
+        <w:drawing>
+          <wp:inline>
+            <wp:extent cx="5943600" cy="4127500"/>
+            <wp:effectExtent b="0" l="0" r="0" t="0"/>
+            <wp:docPr descr="Web: ABMC de paseadores" title="" id="1042" name="Picture"/>
+            <a:graphic>
+              <a:graphicData uri="http://schemas.openxmlformats.org/drawingml/2006/picture">
+                <pic:pic>
+                  <pic:nvPicPr>
+                    <pic:cNvPr descr="capturas/web-paseadores-admin.png" id="1043" name="Picture"/>
+                    <pic:cNvPicPr>
+                      <a:picLocks noChangeArrowheads="1" noChangeAspect="1"/>
+                    </pic:cNvPicPr>
+                  </pic:nvPicPr>
+                  <pic:blipFill>
+                    <a:blip r:embed="rIdCap43"/>
+                    <a:stretch>
+                      <a:fillRect/>
+                    </a:stretch>
+                  </pic:blipFill>
+                  <pic:spPr bwMode="auto">
+                    <a:xfrm>
+                      <a:off x="0" y="0"/>
+                      <a:ext cx="5943600" cy="4127500"/>
+                    </a:xfrm>
+                    <a:prstGeom prst="rect">
+                      <a:avLst/>
+                    </a:prstGeom>
+                    <a:noFill/>
+                    <a:ln w="9525">
+                      <a:noFill/>
+                      <a:headEnd/>
+                      <a:tailEnd/>
+                    </a:ln>
+                  </pic:spPr>
+                </pic:pic>
+              </a:graphicData>
+            </a:graphic>
+          </wp:inline>
+        </w:drawing>
+      </w:r>
+    </w:p>
+    <w:p>
+      <w:pPr>
+        <w:pStyle w:val="ImageCaption"/>
+      </w:pPr>
+      <w:r>
+        <w:t xml:space="preserve">Web: ABMC de paseadores</w:t>
+      </w:r>
+    </w:p>
+    <w:p>
+      <w:pPr>
+        <w:pStyle w:val="CaptionedFigure"/>
+      </w:pPr>
+      <w:r>
+        <w:drawing>
+          <wp:inline>
+            <wp:extent cx="5943600" cy="4127500"/>
+            <wp:effectExtent b="0" l="0" r="0" t="0"/>
+            <wp:docPr descr="Web: ABMC de perros (administrador)" title="" id="1044" name="Picture"/>
+            <a:graphic>
+              <a:graphicData uri="http://schemas.openxmlformats.org/drawingml/2006/picture">
+                <pic:pic>
+                  <pic:nvPicPr>
+                    <pic:cNvPr descr="capturas/web-perros-admin.png" id="1045" name="Picture"/>
+                    <pic:cNvPicPr>
+                      <a:picLocks noChangeArrowheads="1" noChangeAspect="1"/>
+                    </pic:cNvPicPr>
+                  </pic:nvPicPr>
+                  <pic:blipFill>
+                    <a:blip r:embed="rIdCap45"/>
+                    <a:stretch>
+                      <a:fillRect/>
+                    </a:stretch>
+                  </pic:blipFill>
+                  <pic:spPr bwMode="auto">
+                    <a:xfrm>
+                      <a:off x="0" y="0"/>
+                      <a:ext cx="5943600" cy="4127500"/>
+                    </a:xfrm>
+                    <a:prstGeom prst="rect">
+                      <a:avLst/>
+                    </a:prstGeom>
+                    <a:noFill/>
+                    <a:ln w="9525">
+                      <a:noFill/>
+                      <a:headEnd/>
+                      <a:tailEnd/>
+                    </a:ln>
+                  </pic:spPr>
+                </pic:pic>
+              </a:graphicData>
+            </a:graphic>
+          </wp:inline>
+        </w:drawing>
+      </w:r>
+    </w:p>
+    <w:p>
+      <w:pPr>
+        <w:pStyle w:val="ImageCaption"/>
+      </w:pPr>
+      <w:r>
+        <w:t xml:space="preserve">Web: ABMC de perros (administrador)</w:t>
+      </w:r>
+    </w:p>
+    <w:p>
+      <w:pPr>
+        <w:pStyle w:val="CaptionedFigure"/>
+      </w:pPr>
+      <w:r>
+        <w:drawing>
+          <wp:inline>
+            <wp:extent cx="5943600" cy="4127500"/>
+            <wp:effectExtent b="0" l="0" r="0" t="0"/>
+            <wp:docPr descr="Web: perros vistos por un dueño" title="" id="1046" name="Picture"/>
+            <a:graphic>
+              <a:graphicData uri="http://schemas.openxmlformats.org/drawingml/2006/picture">
+                <pic:pic>
+                  <pic:nvPicPr>
+                    <pic:cNvPr descr="capturas/web-perros-dueno.png" id="1047" name="Picture"/>
+                    <pic:cNvPicPr>
+                      <a:picLocks noChangeArrowheads="1" noChangeAspect="1"/>
+                    </pic:cNvPicPr>
+                  </pic:nvPicPr>
+                  <pic:blipFill>
+                    <a:blip r:embed="rIdCap47"/>
+                    <a:stretch>
+                      <a:fillRect/>
+                    </a:stretch>
+                  </pic:blipFill>
+                  <pic:spPr bwMode="auto">
+                    <a:xfrm>
+                      <a:off x="0" y="0"/>
+                      <a:ext cx="5943600" cy="4127500"/>
+                    </a:xfrm>
+                    <a:prstGeom prst="rect">
+                      <a:avLst/>
+                    </a:prstGeom>
+                    <a:noFill/>
+                    <a:ln w="9525">
+                      <a:noFill/>
+                      <a:headEnd/>
+                      <a:tailEnd/>
+                    </a:ln>
+                  </pic:spPr>
+                </pic:pic>
+              </a:graphicData>
+            </a:graphic>
+          </wp:inline>
+        </w:drawing>
+      </w:r>
+    </w:p>
+    <w:p>
+      <w:pPr>
+        <w:pStyle w:val="ImageCaption"/>
+      </w:pPr>
+      <w:r>
+        <w:t xml:space="preserve">Web: perros vistos por un dueño</w:t>
+      </w:r>
+    </w:p>
+    <w:p>
+      <w:pPr>
+        <w:pStyle w:val="CaptionedFigure"/>
+      </w:pPr>
+      <w:r>
+        <w:drawing>
+          <wp:inline>
+            <wp:extent cx="5943600" cy="5159375"/>
+            <wp:effectExtent b="0" l="0" r="0" t="0"/>
+            <wp:docPr descr="Web: ABMC de paseos (administrador)" title="" id="1048" name="Picture"/>
+            <a:graphic>
+              <a:graphicData uri="http://schemas.openxmlformats.org/drawingml/2006/picture">
+                <pic:pic>
+                  <pic:nvPicPr>
+                    <pic:cNvPr descr="capturas/web-paseos-admin.png" id="1049" name="Picture"/>
+                    <pic:cNvPicPr>
+                      <a:picLocks noChangeArrowheads="1" noChangeAspect="1"/>
+                    </pic:cNvPicPr>
+                  </pic:nvPicPr>
+                  <pic:blipFill>
+                    <a:blip r:embed="rIdCap49"/>
+                    <a:stretch>
+                      <a:fillRect/>
+                    </a:stretch>
+                  </pic:blipFill>
+                  <pic:spPr bwMode="auto">
+                    <a:xfrm>
+                      <a:off x="0" y="0"/>
+                      <a:ext cx="5943600" cy="5159375"/>
+                    </a:xfrm>
+                    <a:prstGeom prst="rect">
+                      <a:avLst/>
+                    </a:prstGeom>
+                    <a:noFill/>
+                    <a:ln w="9525">
+                      <a:noFill/>
+                      <a:headEnd/>
+                      <a:tailEnd/>
+                    </a:ln>
+                  </pic:spPr>
+                </pic:pic>
+              </a:graphicData>
+            </a:graphic>
+          </wp:inline>
+        </w:drawing>
+      </w:r>
+    </w:p>
+    <w:p>
+      <w:pPr>
+        <w:pStyle w:val="ImageCaption"/>
+      </w:pPr>
+      <w:r>
+        <w:t xml:space="preserve">Web: ABMC de paseos (administrador)</w:t>
+      </w:r>
+    </w:p>
+    <w:p>
+      <w:pPr>
+        <w:pStyle w:val="CaptionedFigure"/>
+      </w:pPr>
+      <w:r>
+        <w:drawing>
+          <wp:inline>
+            <wp:extent cx="5943600" cy="5159375"/>
+            <wp:effectExtent b="0" l="0" r="0" t="0"/>
+            <wp:docPr descr="Web: búsqueda de paseos filtrando por paseador y rango de fechas" title="" id="1050" name="Picture"/>
+            <a:graphic>
+              <a:graphicData uri="http://schemas.openxmlformats.org/drawingml/2006/picture">
+                <pic:pic>
+                  <pic:nvPicPr>
+                    <pic:cNvPr descr="capturas/web-paseos-admin-filtro.png" id="1051" name="Picture"/>
+                    <pic:cNvPicPr>
+                      <a:picLocks noChangeArrowheads="1" noChangeAspect="1"/>
+                    </pic:cNvPicPr>
+                  </pic:nvPicPr>
+                  <pic:blipFill>
+                    <a:blip r:embed="rIdCap51"/>
+                    <a:stretch>
+                      <a:fillRect/>
+                    </a:stretch>
+                  </pic:blipFill>
+                  <pic:spPr bwMode="auto">
+                    <a:xfrm>
+                      <a:off x="0" y="0"/>
+                      <a:ext cx="5943600" cy="5159375"/>
+                    </a:xfrm>
+                    <a:prstGeom prst="rect">
+                      <a:avLst/>
+                    </a:prstGeom>
+                    <a:noFill/>
+                    <a:ln w="9525">
+                      <a:noFill/>
+                      <a:headEnd/>
+                      <a:tailEnd/>
+                    </a:ln>
+                  </pic:spPr>
+                </pic:pic>
+              </a:graphicData>
+            </a:graphic>
+          </wp:inline>
+        </w:drawing>
+      </w:r>
+    </w:p>
+    <w:p>
+      <w:pPr>
+        <w:pStyle w:val="ImageCaption"/>
+      </w:pPr>
+      <w:r>
+        <w:t xml:space="preserve">Web: búsqueda de paseos filtrando por paseador y rango de fechas</w:t>
+      </w:r>
+    </w:p>
+    <w:p>
+      <w:pPr>
+        <w:pStyle w:val="CaptionedFigure"/>
+      </w:pPr>
+      <w:r>
+        <w:drawing>
+          <wp:inline>
+            <wp:extent cx="5943600" cy="5159375"/>
+            <wp:effectExtent b="0" l="0" r="0" t="0"/>
+            <wp:docPr descr="Web: paseos vistos por un dueño" title="" id="1052" name="Picture"/>
+            <a:graphic>
+              <a:graphicData uri="http://schemas.openxmlformats.org/drawingml/2006/picture">
+                <pic:pic>
+                  <pic:nvPicPr>
+                    <pic:cNvPr descr="capturas/web-paseos-dueno.png" id="1053" name="Picture"/>
+                    <pic:cNvPicPr>
+                      <a:picLocks noChangeArrowheads="1" noChangeAspect="1"/>
+                    </pic:cNvPicPr>
+                  </pic:nvPicPr>
+                  <pic:blipFill>
+                    <a:blip r:embed="rIdCap53"/>
+                    <a:stretch>
+                      <a:fillRect/>
+                    </a:stretch>
+                  </pic:blipFill>
+                  <pic:spPr bwMode="auto">
+                    <a:xfrm>
+                      <a:off x="0" y="0"/>
+                      <a:ext cx="5943600" cy="5159375"/>
+                    </a:xfrm>
+                    <a:prstGeom prst="rect">
+                      <a:avLst/>
+                    </a:prstGeom>
+                    <a:noFill/>
+                    <a:ln w="9525">
+                      <a:noFill/>
+                      <a:headEnd/>
+                      <a:tailEnd/>
+                    </a:ln>
+                  </pic:spPr>
+                </pic:pic>
+              </a:graphicData>
+            </a:graphic>
+          </wp:inline>
+        </w:drawing>
+      </w:r>
+    </w:p>
+    <w:p>
+      <w:pPr>
+        <w:pStyle w:val="ImageCaption"/>
+      </w:pPr>
+      <w:r>
+        <w:t xml:space="preserve">Web: paseos vistos por un dueño</w:t>
+      </w:r>
+    </w:p>
+    <w:p>
+      <w:pPr>
+        <w:pStyle w:val="CaptionedFigure"/>
+      </w:pPr>
+      <w:r>
+        <w:drawing>
+          <wp:inline>
+            <wp:extent cx="5943600" cy="5159375"/>
+            <wp:effectExtent b="0" l="0" r="0" t="0"/>
+            <wp:docPr descr="Web: paseos vistos por un paseador" title="" id="1054" name="Picture"/>
+            <a:graphic>
+              <a:graphicData uri="http://schemas.openxmlformats.org/drawingml/2006/picture">
+                <pic:pic>
+                  <pic:nvPicPr>
+                    <pic:cNvPr descr="capturas/web-paseos-paseador.png" id="1055" name="Picture"/>
+                    <pic:cNvPicPr>
+                      <a:picLocks noChangeArrowheads="1" noChangeAspect="1"/>
+                    </pic:cNvPicPr>
+                  </pic:nvPicPr>
+                  <pic:blipFill>
+                    <a:blip r:embed="rIdCap55"/>
+                    <a:stretch>
+                      <a:fillRect/>
+                    </a:stretch>
+                  </pic:blipFill>
+                  <pic:spPr bwMode="auto">
+                    <a:xfrm>
+                      <a:off x="0" y="0"/>
+                      <a:ext cx="5943600" cy="5159375"/>
+                    </a:xfrm>
+                    <a:prstGeom prst="rect">
+                      <a:avLst/>
+                    </a:prstGeom>
+                    <a:noFill/>
+                    <a:ln w="9525">
+                      <a:noFill/>
+                      <a:headEnd/>
+                      <a:tailEnd/>
+                    </a:ln>
+                  </pic:spPr>
+                </pic:pic>
+              </a:graphicData>
+            </a:graphic>
+          </wp:inline>
+        </w:drawing>
+      </w:r>
+    </w:p>
+    <w:p>
+      <w:pPr>
+        <w:pStyle w:val="ImageCaption"/>
+      </w:pPr>
+      <w:r>
+        <w:t xml:space="preserve">Web: paseos vistos por un paseador</w:t>
+      </w:r>
+    </w:p>
+    <w:p>
+      <w:pPr>
+        <w:pStyle w:val="CaptionedFigure"/>
+      </w:pPr>
+      <w:r>
+        <w:drawing>
+          <wp:inline>
+            <wp:extent cx="5943600" cy="4127500"/>
+            <wp:effectExtent b="0" l="0" r="0" t="0"/>
+            <wp:docPr descr="Web: ABMC de administradores" title="" id="1056" name="Picture"/>
+            <a:graphic>
+              <a:graphicData uri="http://schemas.openxmlformats.org/drawingml/2006/picture">
+                <pic:pic>
+                  <pic:nvPicPr>
+                    <pic:cNvPr descr="capturas/web-administradores-admin.png" id="1057" name="Picture"/>
+                    <pic:cNvPicPr>
+                      <a:picLocks noChangeArrowheads="1" noChangeAspect="1"/>
+                    </pic:cNvPicPr>
+                  </pic:nvPicPr>
+                  <pic:blipFill>
+                    <a:blip r:embed="rIdCap57"/>
+                    <a:stretch>
+                      <a:fillRect/>
+                    </a:stretch>
+                  </pic:blipFill>
+                  <pic:spPr bwMode="auto">
+                    <a:xfrm>
+                      <a:off x="0" y="0"/>
+                      <a:ext cx="5943600" cy="4127500"/>
+                    </a:xfrm>
+                    <a:prstGeom prst="rect">
+                      <a:avLst/>
+                    </a:prstGeom>
+                    <a:noFill/>
+                    <a:ln w="9525">
+                      <a:noFill/>
+                      <a:headEnd/>
+                      <a:tailEnd/>
+                    </a:ln>
+                  </pic:spPr>
+                </pic:pic>
+              </a:graphicData>
+            </a:graphic>
+          </wp:inline>
+        </w:drawing>
+      </w:r>
+    </w:p>
+    <w:p>
+      <w:pPr>
+        <w:pStyle w:val="ImageCaption"/>
+      </w:pPr>
+      <w:r>
+        <w:t xml:space="preserve">Web: ABMC de administradores</w:t>
+      </w:r>
+    </w:p>
+    <w:p>
+      <w:pPr>
+        <w:pStyle w:val="CaptionedFigure"/>
+      </w:pPr>
+      <w:r>
+        <w:drawing>
+          <wp:inline>
+            <wp:extent cx="5943600" cy="5159375"/>
+            <wp:effectExtent b="0" l="0" r="0" t="0"/>
+            <wp:docPr descr="Web: liquidaciones (maestro/detalle) editando una liquidación" title="" id="1058" name="Picture"/>
+            <a:graphic>
+              <a:graphicData uri="http://schemas.openxmlformats.org/drawingml/2006/picture">
+                <pic:pic>
+                  <pic:nvPicPr>
+                    <pic:cNvPr descr="capturas/web-liquidaciones-detalle.png" id="1059" name="Picture"/>
+                    <pic:cNvPicPr>
+                      <a:picLocks noChangeArrowheads="1" noChangeAspect="1"/>
+                    </pic:cNvPicPr>
+                  </pic:nvPicPr>
+                  <pic:blipFill>
+                    <a:blip r:embed="rIdCap59"/>
+                    <a:stretch>
+                      <a:fillRect/>
+                    </a:stretch>
+                  </pic:blipFill>
+                  <pic:spPr bwMode="auto">
+                    <a:xfrm>
+                      <a:off x="0" y="0"/>
+                      <a:ext cx="5943600" cy="5159375"/>
+                    </a:xfrm>
+                    <a:prstGeom prst="rect">
+                      <a:avLst/>
+                    </a:prstGeom>
+                    <a:noFill/>
+                    <a:ln w="9525">
+                      <a:noFill/>
+                      <a:headEnd/>
+                      <a:tailEnd/>
+                    </a:ln>
+                  </pic:spPr>
+                </pic:pic>
+              </a:graphicData>
+            </a:graphic>
+          </wp:inline>
+        </w:drawing>
+      </w:r>
+    </w:p>
+    <w:p>
+      <w:pPr>
+        <w:pStyle w:val="ImageCaption"/>
+      </w:pPr>
+      <w:r>
+        <w:t xml:space="preserve">Web: liquidaciones (maestro/detalle) editando una liquidación</w:t>
       </w:r>
     </w:p>
     <w:bookmarkEnd w:id="18"/>
@@ -2259,7 +3897,227 @@
         <w:pStyle w:val="FirstParagraph"/>
       </w:pPr>
       <w:r>
-        <w:t xml:space="preserve">[COMPLETAR: Recaudación mensual por paseador y Actividad por perro, en escritorio y en web.]</w:t>
+        <w:t xml:space="preserve">Los dos reportes se consultan con ADO.NET y solo los ve el administrador. La recaudación mensual incluye un gráfico de barras (ScottPlot en escritorio, Chart.js en web).</w:t>
+      </w:r>
+    </w:p>
+    <w:p>
+      <w:pPr>
+        <w:pStyle w:val="CaptionedFigure"/>
+      </w:pPr>
+      <w:r>
+        <w:drawing>
+          <wp:inline>
+            <wp:extent cx="5943600" cy="4852487"/>
+            <wp:effectExtent b="0" l="0" r="0" t="0"/>
+            <wp:docPr descr="Escritorio: reporte de recaudación mensual por paseador" title="" id="1060" name="Picture"/>
+            <a:graphic>
+              <a:graphicData uri="http://schemas.openxmlformats.org/drawingml/2006/picture">
+                <pic:pic>
+                  <pic:nvPicPr>
+                    <pic:cNvPr descr="capturas/esc-reporterecaudacion-admin.png" id="1061" name="Picture"/>
+                    <pic:cNvPicPr>
+                      <a:picLocks noChangeArrowheads="1" noChangeAspect="1"/>
+                    </pic:cNvPicPr>
+                  </pic:nvPicPr>
+                  <pic:blipFill>
+                    <a:blip r:embed="rIdCap61"/>
+                    <a:stretch>
+                      <a:fillRect/>
+                    </a:stretch>
+                  </pic:blipFill>
+                  <pic:spPr bwMode="auto">
+                    <a:xfrm>
+                      <a:off x="0" y="0"/>
+                      <a:ext cx="5943600" cy="4852487"/>
+                    </a:xfrm>
+                    <a:prstGeom prst="rect">
+                      <a:avLst/>
+                    </a:prstGeom>
+                    <a:noFill/>
+                    <a:ln w="9525">
+                      <a:noFill/>
+                      <a:headEnd/>
+                      <a:tailEnd/>
+                    </a:ln>
+                  </pic:spPr>
+                </pic:pic>
+              </a:graphicData>
+            </a:graphic>
+          </wp:inline>
+        </w:drawing>
+      </w:r>
+    </w:p>
+    <w:p>
+      <w:pPr>
+        <w:pStyle w:val="ImageCaption"/>
+      </w:pPr>
+      <w:r>
+        <w:t xml:space="preserve">Escritorio: reporte de recaudación mensual por paseador</w:t>
+      </w:r>
+    </w:p>
+    <w:p>
+      <w:pPr>
+        <w:pStyle w:val="CaptionedFigure"/>
+      </w:pPr>
+      <w:r>
+        <w:drawing>
+          <wp:inline>
+            <wp:extent cx="5943600" cy="3907786"/>
+            <wp:effectExtent b="0" l="0" r="0" t="0"/>
+            <wp:docPr descr="Escritorio: reporte de actividad por perro" title="" id="1062" name="Picture"/>
+            <a:graphic>
+              <a:graphicData uri="http://schemas.openxmlformats.org/drawingml/2006/picture">
+                <pic:pic>
+                  <pic:nvPicPr>
+                    <pic:cNvPr descr="capturas/esc-reporteactividad-admin.png" id="1063" name="Picture"/>
+                    <pic:cNvPicPr>
+                      <a:picLocks noChangeArrowheads="1" noChangeAspect="1"/>
+                    </pic:cNvPicPr>
+                  </pic:nvPicPr>
+                  <pic:blipFill>
+                    <a:blip r:embed="rIdCap63"/>
+                    <a:stretch>
+                      <a:fillRect/>
+                    </a:stretch>
+                  </pic:blipFill>
+                  <pic:spPr bwMode="auto">
+                    <a:xfrm>
+                      <a:off x="0" y="0"/>
+                      <a:ext cx="5943600" cy="3907786"/>
+                    </a:xfrm>
+                    <a:prstGeom prst="rect">
+                      <a:avLst/>
+                    </a:prstGeom>
+                    <a:noFill/>
+                    <a:ln w="9525">
+                      <a:noFill/>
+                      <a:headEnd/>
+                      <a:tailEnd/>
+                    </a:ln>
+                  </pic:spPr>
+                </pic:pic>
+              </a:graphicData>
+            </a:graphic>
+          </wp:inline>
+        </w:drawing>
+      </w:r>
+    </w:p>
+    <w:p>
+      <w:pPr>
+        <w:pStyle w:val="ImageCaption"/>
+      </w:pPr>
+      <w:r>
+        <w:t xml:space="preserve">Escritorio: reporte de actividad por perro</w:t>
+      </w:r>
+    </w:p>
+    <w:p>
+      <w:pPr>
+        <w:pStyle w:val="CaptionedFigure"/>
+      </w:pPr>
+      <w:r>
+        <w:drawing>
+          <wp:inline>
+            <wp:extent cx="5943600" cy="4977765"/>
+            <wp:effectExtent b="0" l="0" r="0" t="0"/>
+            <wp:docPr descr="Web: reporte de recaudación mensual por paseador" title="" id="1064" name="Picture"/>
+            <a:graphic>
+              <a:graphicData uri="http://schemas.openxmlformats.org/drawingml/2006/picture">
+                <pic:pic>
+                  <pic:nvPicPr>
+                    <pic:cNvPr descr="capturas/web-reportes-recaudacion-admin.png" id="1065" name="Picture"/>
+                    <pic:cNvPicPr>
+                      <a:picLocks noChangeArrowheads="1" noChangeAspect="1"/>
+                    </pic:cNvPicPr>
+                  </pic:nvPicPr>
+                  <pic:blipFill>
+                    <a:blip r:embed="rIdCap65"/>
+                    <a:stretch>
+                      <a:fillRect/>
+                    </a:stretch>
+                  </pic:blipFill>
+                  <pic:spPr bwMode="auto">
+                    <a:xfrm>
+                      <a:off x="0" y="0"/>
+                      <a:ext cx="5943600" cy="4977765"/>
+                    </a:xfrm>
+                    <a:prstGeom prst="rect">
+                      <a:avLst/>
+                    </a:prstGeom>
+                    <a:noFill/>
+                    <a:ln w="9525">
+                      <a:noFill/>
+                      <a:headEnd/>
+                      <a:tailEnd/>
+                    </a:ln>
+                  </pic:spPr>
+                </pic:pic>
+              </a:graphicData>
+            </a:graphic>
+          </wp:inline>
+        </w:drawing>
+      </w:r>
+    </w:p>
+    <w:p>
+      <w:pPr>
+        <w:pStyle w:val="ImageCaption"/>
+      </w:pPr>
+      <w:r>
+        <w:t xml:space="preserve">Web: reporte de recaudación mensual por paseador</w:t>
+      </w:r>
+    </w:p>
+    <w:p>
+      <w:pPr>
+        <w:pStyle w:val="CaptionedFigure"/>
+      </w:pPr>
+      <w:r>
+        <w:drawing>
+          <wp:inline>
+            <wp:extent cx="5943600" cy="4127500"/>
+            <wp:effectExtent b="0" l="0" r="0" t="0"/>
+            <wp:docPr descr="Web: reporte de actividad por perro" title="" id="1066" name="Picture"/>
+            <a:graphic>
+              <a:graphicData uri="http://schemas.openxmlformats.org/drawingml/2006/picture">
+                <pic:pic>
+                  <pic:nvPicPr>
+                    <pic:cNvPr descr="capturas/web-reportes-actividad-admin.png" id="1067" name="Picture"/>
+                    <pic:cNvPicPr>
+                      <a:picLocks noChangeArrowheads="1" noChangeAspect="1"/>
+                    </pic:cNvPicPr>
+                  </pic:nvPicPr>
+                  <pic:blipFill>
+                    <a:blip r:embed="rIdCap67"/>
+                    <a:stretch>
+                      <a:fillRect/>
+                    </a:stretch>
+                  </pic:blipFill>
+                  <pic:spPr bwMode="auto">
+                    <a:xfrm>
+                      <a:off x="0" y="0"/>
+                      <a:ext cx="5943600" cy="4127500"/>
+                    </a:xfrm>
+                    <a:prstGeom prst="rect">
+                      <a:avLst/>
+                    </a:prstGeom>
+                    <a:noFill/>
+                    <a:ln w="9525">
+                      <a:noFill/>
+                      <a:headEnd/>
+                      <a:tailEnd/>
+                    </a:ln>
+                  </pic:spPr>
+                </pic:pic>
+              </a:graphicData>
+            </a:graphic>
+          </wp:inline>
+        </w:drawing>
+      </w:r>
+    </w:p>
+    <w:p>
+      <w:pPr>
+        <w:pStyle w:val="ImageCaption"/>
+      </w:pPr>
+      <w:r>
+        <w:t xml:space="preserve">Web: reporte de actividad por perro</w:t>
       </w:r>
     </w:p>
     <w:bookmarkEnd w:id="19"/>

</xml_diff>

<commit_message>
Docs: caratula con docentes, grupo y ciclo lectivo
</commit_message>
<xml_diff>
--- a/docs/Documentacion_TPI.docx
+++ b/docs/Documentacion_TPI.docx
@@ -160,6 +160,34 @@
                 <w:b/>
                 <w:bCs/>
               </w:rPr>
+              <w:t xml:space="preserve">Ciclo lectivo</w:t>
+            </w:r>
+          </w:p>
+        </w:tc>
+        <w:tc>
+          <w:tcPr/>
+          <w:p>
+            <w:pPr>
+              <w:pStyle w:val="Compact"/>
+            </w:pPr>
+            <w:r>
+              <w:t xml:space="preserve">2026</w:t>
+            </w:r>
+          </w:p>
+        </w:tc>
+      </w:tr>
+      <w:tr>
+        <w:tc>
+          <w:tcPr/>
+          <w:p>
+            <w:pPr>
+              <w:pStyle w:val="Compact"/>
+            </w:pPr>
+            <w:r>
+              <w:rPr>
+                <w:b/>
+                <w:bCs/>
+              </w:rPr>
               <w:t xml:space="preserve">Docentes</w:t>
             </w:r>
           </w:p>
@@ -171,7 +199,28 @@
               <w:pStyle w:val="Compact"/>
             </w:pPr>
             <w:r>
-              <w:t xml:space="preserve">[COMPLETAR]</w:t>
+              <w:t xml:space="preserve">Ezequiel Porta</w:t>
+            </w:r>
+          </w:p>
+        </w:tc>
+      </w:tr>
+      <w:tr>
+        <w:tc>
+          <w:tcPr/>
+          <w:p>
+            <w:pPr>
+              <w:pStyle w:val="Compact"/>
+            </w:pPr>
+          </w:p>
+        </w:tc>
+        <w:tc>
+          <w:tcPr/>
+          <w:p>
+            <w:pPr>
+              <w:pStyle w:val="Compact"/>
+            </w:pPr>
+            <w:r>
+              <w:t xml:space="preserve">Sebastian Rocco</w:t>
             </w:r>
           </w:p>
         </w:tc>
@@ -199,7 +248,7 @@
               <w:pStyle w:val="Compact"/>
             </w:pPr>
             <w:r>
-              <w:t xml:space="preserve">[COMPLETAR]</w:t>
+              <w:t xml:space="preserve">7</w:t>
             </w:r>
           </w:p>
         </w:tc>

</xml_diff>

<commit_message>
Docs: regenerar el Word con los ultimos cambios
</commit_message>
<xml_diff>
--- a/docs/Documentacion_TPI.docx
+++ b/docs/Documentacion_TPI.docx
@@ -2,22 +2,6 @@
 <file path=word/document.xml><?xml version="1.0" encoding="utf-8"?>
 <w:document xmlns:w="http://schemas.openxmlformats.org/wordprocessingml/2006/main" xmlns:m="http://schemas.openxmlformats.org/officeDocument/2006/math" xmlns:r="http://schemas.openxmlformats.org/officeDocument/2006/relationships" xmlns:o="urn:schemas-microsoft-com:office:office" xmlns:v="urn:schemas-microsoft-com:vml" xmlns:w10="urn:schemas-microsoft-com:office:word" xmlns:a="http://schemas.openxmlformats.org/drawingml/2006/main" xmlns:pic="http://schemas.openxmlformats.org/drawingml/2006/picture" xmlns:wp="http://schemas.openxmlformats.org/drawingml/2006/wordprocessingDrawing">
   <w:body>
-    <w:p>
-      <w:pPr>
-        <w:pStyle w:val="Title"/>
-      </w:pPr>
-      <w:r>
-        <w:t xml:space="preserve">Sistema de Paseadores de Perros</w:t>
-      </w:r>
-    </w:p>
-    <w:p>
-      <w:pPr>
-        <w:pStyle w:val="Subtitle"/>
-      </w:pPr>
-      <w:r>
-        <w:t xml:space="preserve">Trabajo Práctico Integrador — Entrega final</w:t>
-      </w:r>
-    </w:p>
     <w:sdt>
       <w:sdtPr>
         <w:docPartObj>
@@ -613,7 +597,19 @@
         <w:t xml:space="preserve"> </w:t>
       </w:r>
       <w:r>
-        <w:t xml:space="preserve">tener formato válido.</w:t>
+        <w:t xml:space="preserve">tener formato válido y como máximo 256 caracteres. La regla vale entre los tres tipos (un dueño no puede</w:t>
+      </w:r>
+      <w:r>
+        <w:t xml:space="preserve"> </w:t>
+      </w:r>
+      <w:r>
+        <w:t xml:space="preserve">usar el email de un administrador ni de un paseador) y no distingue mayúsculas. La controla el servicio</w:t>
+      </w:r>
+      <w:r>
+        <w:t xml:space="preserve"> </w:t>
+      </w:r>
+      <w:r>
+        <w:t xml:space="preserve">y, además, la garantiza un índice único en la base.</w:t>
       </w:r>
     </w:p>
     <w:p>
@@ -775,7 +771,19 @@
         </w:numPr>
       </w:pPr>
       <w:r>
-        <w:t xml:space="preserve">No se puede agendar un paseo en una fecha y hora que ya pasó.</w:t>
+        <w:t xml:space="preserve">No se puede agendar un paseo en una fecha y hora que ya pasó, ni al darlo de alta ni al modificarlo.</w:t>
+      </w:r>
+    </w:p>
+    <w:p>
+      <w:pPr>
+        <w:pStyle w:val="Compact"/>
+        <w:numPr>
+          <w:ilvl w:val="0"/>
+          <w:numId w:val="1004"/>
+        </w:numPr>
+      </w:pPr>
+      <w:r>
+        <w:t xml:space="preserve">Un paseo que ya pasó no se puede modificar, tampoco el administrador: se liquida tal como fue.</w:t>
       </w:r>
     </w:p>
     <w:p>
@@ -1044,7 +1052,7 @@
               <w:pStyle w:val="Compact"/>
             </w:pPr>
             <w:r>
-              <w:t xml:space="preserve">Consultar dueños, paseadores, perros y paseos</w:t>
+              <w:t xml:space="preserve">Consultar dueños</w:t>
             </w:r>
           </w:p>
         </w:tc>
@@ -1056,7 +1064,7 @@
               <w:jc w:val="center"/>
             </w:pPr>
             <w:r>
-              <w:t xml:space="preserve">sí</w:t>
+              <w:t xml:space="preserve">todos</w:t>
             </w:r>
           </w:p>
         </w:tc>
@@ -1068,7 +1076,7 @@
               <w:jc w:val="center"/>
             </w:pPr>
             <w:r>
-              <w:t xml:space="preserve">sí</w:t>
+              <w:t xml:space="preserve">solo él mismo</w:t>
             </w:r>
           </w:p>
         </w:tc>
@@ -1080,7 +1088,7 @@
               <w:jc w:val="center"/>
             </w:pPr>
             <w:r>
-              <w:t xml:space="preserve">sí</w:t>
+              <w:t xml:space="preserve">no</w:t>
             </w:r>
           </w:p>
         </w:tc>
@@ -1093,7 +1101,7 @@
               <w:pStyle w:val="Compact"/>
             </w:pPr>
             <w:r>
-              <w:t xml:space="preserve">Alta, baja y modificación de dueños</w:t>
+              <w:t xml:space="preserve">Consultar perros</w:t>
             </w:r>
           </w:p>
         </w:tc>
@@ -1105,7 +1113,7 @@
               <w:jc w:val="center"/>
             </w:pPr>
             <w:r>
-              <w:t xml:space="preserve">sí</w:t>
+              <w:t xml:space="preserve">todos</w:t>
             </w:r>
           </w:p>
         </w:tc>
@@ -1117,7 +1125,7 @@
               <w:jc w:val="center"/>
             </w:pPr>
             <w:r>
-              <w:t xml:space="preserve">no</w:t>
+              <w:t xml:space="preserve">solo los suyos</w:t>
             </w:r>
           </w:p>
         </w:tc>
@@ -1129,7 +1137,7 @@
               <w:jc w:val="center"/>
             </w:pPr>
             <w:r>
-              <w:t xml:space="preserve">no</w:t>
+              <w:t xml:space="preserve">todos, sin el nombre del dueño</w:t>
             </w:r>
           </w:p>
         </w:tc>
@@ -1142,7 +1150,7 @@
               <w:pStyle w:val="Compact"/>
             </w:pPr>
             <w:r>
-              <w:t xml:space="preserve">Alta, baja y modificación de paseadores</w:t>
+              <w:t xml:space="preserve">Consultar paseadores</w:t>
             </w:r>
           </w:p>
         </w:tc>
@@ -1154,7 +1162,7 @@
               <w:jc w:val="center"/>
             </w:pPr>
             <w:r>
-              <w:t xml:space="preserve">sí</w:t>
+              <w:t xml:space="preserve">todos</w:t>
             </w:r>
           </w:p>
         </w:tc>
@@ -1166,7 +1174,7 @@
               <w:jc w:val="center"/>
             </w:pPr>
             <w:r>
-              <w:t xml:space="preserve">no</w:t>
+              <w:t xml:space="preserve">todos, sin email ni teléfono</w:t>
             </w:r>
           </w:p>
         </w:tc>
@@ -1178,7 +1186,7 @@
               <w:jc w:val="center"/>
             </w:pPr>
             <w:r>
-              <w:t xml:space="preserve">no</w:t>
+              <w:t xml:space="preserve">solo él mismo</w:t>
             </w:r>
           </w:p>
         </w:tc>
@@ -1191,7 +1199,7 @@
               <w:pStyle w:val="Compact"/>
             </w:pPr>
             <w:r>
-              <w:t xml:space="preserve">Alta, baja y modificación de perros</w:t>
+              <w:t xml:space="preserve">Buscar paseadores por texto</w:t>
             </w:r>
           </w:p>
         </w:tc>
@@ -1215,7 +1223,7 @@
               <w:jc w:val="center"/>
             </w:pPr>
             <w:r>
-              <w:t xml:space="preserve">sí (los suyos)</w:t>
+              <w:t xml:space="preserve">no</w:t>
             </w:r>
           </w:p>
         </w:tc>
@@ -1240,7 +1248,7 @@
               <w:pStyle w:val="Compact"/>
             </w:pPr>
             <w:r>
-              <w:t xml:space="preserve">Alta, baja y modificación de paseos</w:t>
+              <w:t xml:space="preserve">Consultar paseos</w:t>
             </w:r>
           </w:p>
         </w:tc>
@@ -1252,7 +1260,7 @@
               <w:jc w:val="center"/>
             </w:pPr>
             <w:r>
-              <w:t xml:space="preserve">sí</w:t>
+              <w:t xml:space="preserve">todos</w:t>
             </w:r>
           </w:p>
         </w:tc>
@@ -1264,7 +1272,7 @@
               <w:jc w:val="center"/>
             </w:pPr>
             <w:r>
-              <w:t xml:space="preserve">sí (de sus perros)</w:t>
+              <w:t xml:space="preserve">los de sus perros</w:t>
             </w:r>
           </w:p>
         </w:tc>
@@ -1276,7 +1284,7 @@
               <w:jc w:val="center"/>
             </w:pPr>
             <w:r>
-              <w:t xml:space="preserve">sí (los suyos)</w:t>
+              <w:t xml:space="preserve">los suyos</w:t>
             </w:r>
           </w:p>
         </w:tc>
@@ -1289,7 +1297,7 @@
               <w:pStyle w:val="Compact"/>
             </w:pPr>
             <w:r>
-              <w:t xml:space="preserve">Administradores (todo)</w:t>
+              <w:t xml:space="preserve">Alta, baja y modificación de dueños</w:t>
             </w:r>
           </w:p>
         </w:tc>
@@ -1338,7 +1346,7 @@
               <w:pStyle w:val="Compact"/>
             </w:pPr>
             <w:r>
-              <w:t xml:space="preserve">Liquidaciones (todo)</w:t>
+              <w:t xml:space="preserve">Alta, baja y modificación de paseadores</w:t>
             </w:r>
           </w:p>
         </w:tc>
@@ -1387,6 +1395,202 @@
               <w:pStyle w:val="Compact"/>
             </w:pPr>
             <w:r>
+              <w:t xml:space="preserve">Alta, baja y modificación de perros</w:t>
+            </w:r>
+          </w:p>
+        </w:tc>
+        <w:tc>
+          <w:tcPr/>
+          <w:p>
+            <w:pPr>
+              <w:pStyle w:val="Compact"/>
+              <w:jc w:val="center"/>
+            </w:pPr>
+            <w:r>
+              <w:t xml:space="preserve">sí</w:t>
+            </w:r>
+          </w:p>
+        </w:tc>
+        <w:tc>
+          <w:tcPr/>
+          <w:p>
+            <w:pPr>
+              <w:pStyle w:val="Compact"/>
+              <w:jc w:val="center"/>
+            </w:pPr>
+            <w:r>
+              <w:t xml:space="preserve">sí (los suyos)</w:t>
+            </w:r>
+          </w:p>
+        </w:tc>
+        <w:tc>
+          <w:tcPr/>
+          <w:p>
+            <w:pPr>
+              <w:pStyle w:val="Compact"/>
+              <w:jc w:val="center"/>
+            </w:pPr>
+            <w:r>
+              <w:t xml:space="preserve">no</w:t>
+            </w:r>
+          </w:p>
+        </w:tc>
+      </w:tr>
+      <w:tr>
+        <w:tc>
+          <w:tcPr/>
+          <w:p>
+            <w:pPr>
+              <w:pStyle w:val="Compact"/>
+            </w:pPr>
+            <w:r>
+              <w:t xml:space="preserve">Alta, baja y modificación de paseos</w:t>
+            </w:r>
+          </w:p>
+        </w:tc>
+        <w:tc>
+          <w:tcPr/>
+          <w:p>
+            <w:pPr>
+              <w:pStyle w:val="Compact"/>
+              <w:jc w:val="center"/>
+            </w:pPr>
+            <w:r>
+              <w:t xml:space="preserve">sí</w:t>
+            </w:r>
+          </w:p>
+        </w:tc>
+        <w:tc>
+          <w:tcPr/>
+          <w:p>
+            <w:pPr>
+              <w:pStyle w:val="Compact"/>
+              <w:jc w:val="center"/>
+            </w:pPr>
+            <w:r>
+              <w:t xml:space="preserve">sí (de sus perros)</w:t>
+            </w:r>
+          </w:p>
+        </w:tc>
+        <w:tc>
+          <w:tcPr/>
+          <w:p>
+            <w:pPr>
+              <w:pStyle w:val="Compact"/>
+              <w:jc w:val="center"/>
+            </w:pPr>
+            <w:r>
+              <w:t xml:space="preserve">sí (los suyos)</w:t>
+            </w:r>
+          </w:p>
+        </w:tc>
+      </w:tr>
+      <w:tr>
+        <w:tc>
+          <w:tcPr/>
+          <w:p>
+            <w:pPr>
+              <w:pStyle w:val="Compact"/>
+            </w:pPr>
+            <w:r>
+              <w:t xml:space="preserve">Administradores (todo)</w:t>
+            </w:r>
+          </w:p>
+        </w:tc>
+        <w:tc>
+          <w:tcPr/>
+          <w:p>
+            <w:pPr>
+              <w:pStyle w:val="Compact"/>
+              <w:jc w:val="center"/>
+            </w:pPr>
+            <w:r>
+              <w:t xml:space="preserve">sí</w:t>
+            </w:r>
+          </w:p>
+        </w:tc>
+        <w:tc>
+          <w:tcPr/>
+          <w:p>
+            <w:pPr>
+              <w:pStyle w:val="Compact"/>
+              <w:jc w:val="center"/>
+            </w:pPr>
+            <w:r>
+              <w:t xml:space="preserve">no</w:t>
+            </w:r>
+          </w:p>
+        </w:tc>
+        <w:tc>
+          <w:tcPr/>
+          <w:p>
+            <w:pPr>
+              <w:pStyle w:val="Compact"/>
+              <w:jc w:val="center"/>
+            </w:pPr>
+            <w:r>
+              <w:t xml:space="preserve">no</w:t>
+            </w:r>
+          </w:p>
+        </w:tc>
+      </w:tr>
+      <w:tr>
+        <w:tc>
+          <w:tcPr/>
+          <w:p>
+            <w:pPr>
+              <w:pStyle w:val="Compact"/>
+            </w:pPr>
+            <w:r>
+              <w:t xml:space="preserve">Liquidaciones (todo)</w:t>
+            </w:r>
+          </w:p>
+        </w:tc>
+        <w:tc>
+          <w:tcPr/>
+          <w:p>
+            <w:pPr>
+              <w:pStyle w:val="Compact"/>
+              <w:jc w:val="center"/>
+            </w:pPr>
+            <w:r>
+              <w:t xml:space="preserve">sí</w:t>
+            </w:r>
+          </w:p>
+        </w:tc>
+        <w:tc>
+          <w:tcPr/>
+          <w:p>
+            <w:pPr>
+              <w:pStyle w:val="Compact"/>
+              <w:jc w:val="center"/>
+            </w:pPr>
+            <w:r>
+              <w:t xml:space="preserve">no</w:t>
+            </w:r>
+          </w:p>
+        </w:tc>
+        <w:tc>
+          <w:tcPr/>
+          <w:p>
+            <w:pPr>
+              <w:pStyle w:val="Compact"/>
+              <w:jc w:val="center"/>
+            </w:pPr>
+            <w:r>
+              <w:t xml:space="preserve">no</w:t>
+            </w:r>
+          </w:p>
+        </w:tc>
+      </w:tr>
+      <w:tr>
+        <w:tc>
+          <w:tcPr/>
+          <w:p>
+            <w:pPr>
+              <w:pStyle w:val="Compact"/>
+            </w:pPr>
+            <w:r>
               <w:t xml:space="preserve">Reportes</w:t>
             </w:r>
           </w:p>
@@ -1441,6 +1645,38 @@
       </w:r>
       <w:r>
         <w:t xml:space="preserve">opciones que el rol no puede usar.</w:t>
+      </w:r>
+    </w:p>
+    <w:p>
+      <w:pPr>
+        <w:pStyle w:val="BodyText"/>
+      </w:pPr>
+      <w:r>
+        <w:t xml:space="preserve">Las consultas también las filtra la API, con el usuario del token: si un dueño o un paseador pide datos</w:t>
+      </w:r>
+      <w:r>
+        <w:t xml:space="preserve"> </w:t>
+      </w:r>
+      <w:r>
+        <w:t xml:space="preserve">ajenos (por id o con otro filtro en la búsqueda de paseos), recibe solo lo suyo o un 403. Hay dos</w:t>
+      </w:r>
+      <w:r>
+        <w:t xml:space="preserve"> </w:t>
+      </w:r>
+      <w:r>
+        <w:t xml:space="preserve">excepciones a propósito. El dueño ve la lista de paseadores, porque la necesita para elegir uno al pedir un</w:t>
+      </w:r>
+      <w:r>
+        <w:t xml:space="preserve"> </w:t>
+      </w:r>
+      <w:r>
+        <w:t xml:space="preserve">paseo, pero sin email ni teléfono. El paseador ve la lista de perros, porque la necesita para registrar un</w:t>
+      </w:r>
+      <w:r>
+        <w:t xml:space="preserve"> </w:t>
+      </w:r>
+      <w:r>
+        <w:t xml:space="preserve">paseo, pero sin el nombre del dueño.</w:t>
       </w:r>
     </w:p>
     <w:bookmarkEnd w:id="12"/>
@@ -2144,7 +2380,7 @@
               <w:t xml:space="preserve"> </w:t>
             </w:r>
             <w:r>
-              <w:t xml:space="preserve">en escritorio y en web; la clave JWT, la cadena de conexión y los orígenes CORS, del</w:t>
+              <w:t xml:space="preserve">en escritorio y en web; la cadena de conexión y los orígenes CORS, del</w:t>
             </w:r>
             <w:r>
               <w:t xml:space="preserve"> </w:t>
@@ -2159,7 +2395,19 @@
               <w:t xml:space="preserve"> </w:t>
             </w:r>
             <w:r>
-              <w:t xml:space="preserve">de la API.</w:t>
+              <w:t xml:space="preserve">de la API. La clave para firmar los tokens JWT no está en el repositorio: se carga con user-secrets en desarrollo o con la variable de entorno</w:t>
+            </w:r>
+            <w:r>
+              <w:t xml:space="preserve"> </w:t>
+            </w:r>
+            <w:r>
+              <w:rPr>
+                <w:rStyle w:val="VerbatimChar"/>
+              </w:rPr>
+              <w:t xml:space="preserve">Jwt__ClaveSecreta</w:t>
+            </w:r>
+            <w:r>
+              <w:t xml:space="preserve">, y sin ella la API no arranca.</w:t>
             </w:r>
           </w:p>
         </w:tc>
@@ -2229,7 +2477,7 @@
     </w:tbl>
     <w:bookmarkEnd w:id="15"/>
     <w:bookmarkEnd w:id="16"/>
-    <w:bookmarkStart w:id="20" w:name="capturas-de-pantalla"/>
+    <w:bookmarkStart w:id="122" w:name="capturas-de-pantalla"/>
     <w:p>
       <w:pPr>
         <w:pStyle w:val="Heading1"/>
@@ -2246,7 +2494,7 @@
         <w:t xml:space="preserve">Capturas tomadas con los datos de prueba, ingresando con cada uno de los tres roles: administrador (admin@paseos.com), dueño (ana.gomez@paseos.com) y paseador (carlos.ruiz@paseos.com).</w:t>
       </w:r>
     </w:p>
-    <w:bookmarkStart w:id="17" w:name="aplicación-de-escritorio"/>
+    <w:bookmarkStart w:id="65" w:name="aplicación-de-escritorio"/>
     <w:p>
       <w:pPr>
         <w:pStyle w:val="Heading2"/>
@@ -2270,20 +2518,20 @@
       <w:r>
         <w:drawing>
           <wp:inline>
-            <wp:extent cx="3200400" cy="2754040"/>
+            <wp:extent cx="3432590" cy="2953847"/>
             <wp:effectExtent b="0" l="0" r="0" t="0"/>
-            <wp:docPr descr="Escritorio: inicio de sesión" title="" id="1000" name="Picture"/>
+            <wp:docPr descr="Escritorio: inicio de sesión" title="" id="18" name="Picture"/>
             <a:graphic>
               <a:graphicData uri="http://schemas.openxmlformats.org/drawingml/2006/picture">
                 <pic:pic>
                   <pic:nvPicPr>
-                    <pic:cNvPr descr="capturas/esc-01-login.png" id="1001" name="Picture"/>
+                    <pic:cNvPr descr="capturas/esc-01-login.png" id="19" name="Picture"/>
                     <pic:cNvPicPr>
                       <a:picLocks noChangeArrowheads="1" noChangeAspect="1"/>
                     </pic:cNvPicPr>
                   </pic:nvPicPr>
                   <pic:blipFill>
-                    <a:blip r:embed="rIdCap1"/>
+                    <a:blip r:embed="rId17"/>
                     <a:stretch>
                       <a:fillRect/>
                     </a:stretch>
@@ -2291,7 +2539,7 @@
                   <pic:spPr bwMode="auto">
                     <a:xfrm>
                       <a:off x="0" y="0"/>
-                      <a:ext cx="3200400" cy="2754040"/>
+                      <a:ext cx="3432590" cy="2953847"/>
                     </a:xfrm>
                     <a:prstGeom prst="rect">
                       <a:avLst/>
@@ -2325,20 +2573,20 @@
       <w:r>
         <w:drawing>
           <wp:inline>
-            <wp:extent cx="5943600" cy="2745137"/>
+            <wp:extent cx="4519338" cy="2087321"/>
             <wp:effectExtent b="0" l="0" r="0" t="0"/>
-            <wp:docPr descr="Escritorio: menú Gestión del administrador" title="" id="1002" name="Picture"/>
+            <wp:docPr descr="Escritorio: menú Gestión del administrador" title="" id="21" name="Picture"/>
             <a:graphic>
               <a:graphicData uri="http://schemas.openxmlformats.org/drawingml/2006/picture">
                 <pic:pic>
                   <pic:nvPicPr>
-                    <pic:cNvPr descr="capturas/esc-menu-admin.png" id="1003" name="Picture"/>
+                    <pic:cNvPr descr="capturas/esc-menu-admin.png" id="22" name="Picture"/>
                     <pic:cNvPicPr>
                       <a:picLocks noChangeArrowheads="1" noChangeAspect="1"/>
                     </pic:cNvPicPr>
                   </pic:nvPicPr>
                   <pic:blipFill>
-                    <a:blip r:embed="rIdCap3"/>
+                    <a:blip r:embed="rId20"/>
                     <a:stretch>
                       <a:fillRect/>
                     </a:stretch>
@@ -2346,7 +2594,7 @@
                   <pic:spPr bwMode="auto">
                     <a:xfrm>
                       <a:off x="0" y="0"/>
-                      <a:ext cx="5943600" cy="2745137"/>
+                      <a:ext cx="4519338" cy="2087321"/>
                     </a:xfrm>
                     <a:prstGeom prst="rect">
                       <a:avLst/>
@@ -2380,20 +2628,20 @@
       <w:r>
         <w:drawing>
           <wp:inline>
-            <wp:extent cx="5943600" cy="1880886"/>
+            <wp:extent cx="5334000" cy="1687974"/>
             <wp:effectExtent b="0" l="0" r="0" t="0"/>
-            <wp:docPr descr="Escritorio: menú Reportes del administrador" title="" id="1004" name="Picture"/>
+            <wp:docPr descr="Escritorio: menú Reportes del administrador" title="" id="24" name="Picture"/>
             <a:graphic>
               <a:graphicData uri="http://schemas.openxmlformats.org/drawingml/2006/picture">
                 <pic:pic>
                   <pic:nvPicPr>
-                    <pic:cNvPr descr="capturas/esc-menu-admin-reportes.png" id="1005" name="Picture"/>
+                    <pic:cNvPr descr="capturas/esc-menu-admin-reportes.png" id="25" name="Picture"/>
                     <pic:cNvPicPr>
                       <a:picLocks noChangeArrowheads="1" noChangeAspect="1"/>
                     </pic:cNvPicPr>
                   </pic:nvPicPr>
                   <pic:blipFill>
-                    <a:blip r:embed="rIdCap5"/>
+                    <a:blip r:embed="rId23"/>
                     <a:stretch>
                       <a:fillRect/>
                     </a:stretch>
@@ -2401,7 +2649,7 @@
                   <pic:spPr bwMode="auto">
                     <a:xfrm>
                       <a:off x="0" y="0"/>
-                      <a:ext cx="5943600" cy="1880886"/>
+                      <a:ext cx="5334000" cy="1687974"/>
                     </a:xfrm>
                     <a:prstGeom prst="rect">
                       <a:avLst/>
@@ -2435,20 +2683,20 @@
       <w:r>
         <w:drawing>
           <wp:inline>
-            <wp:extent cx="5943600" cy="2518474"/>
+            <wp:extent cx="4519338" cy="1914973"/>
             <wp:effectExtent b="0" l="0" r="0" t="0"/>
-            <wp:docPr descr="Escritorio: menú del dueño (solo Perros y Paseos)" title="" id="1006" name="Picture"/>
+            <wp:docPr descr="Escritorio: menú del dueño (solo Perros y Paseos)" title="" id="27" name="Picture"/>
             <a:graphic>
               <a:graphicData uri="http://schemas.openxmlformats.org/drawingml/2006/picture">
                 <pic:pic>
                   <pic:nvPicPr>
-                    <pic:cNvPr descr="capturas/esc-menu-dueno.png" id="1007" name="Picture"/>
+                    <pic:cNvPr descr="capturas/esc-menu-dueno.png" id="28" name="Picture"/>
                     <pic:cNvPicPr>
                       <a:picLocks noChangeArrowheads="1" noChangeAspect="1"/>
                     </pic:cNvPicPr>
                   </pic:nvPicPr>
                   <pic:blipFill>
-                    <a:blip r:embed="rIdCap7"/>
+                    <a:blip r:embed="rId26"/>
                     <a:stretch>
                       <a:fillRect/>
                     </a:stretch>
@@ -2456,7 +2704,7 @@
                   <pic:spPr bwMode="auto">
                     <a:xfrm>
                       <a:off x="0" y="0"/>
-                      <a:ext cx="5943600" cy="2518474"/>
+                      <a:ext cx="4519338" cy="1914973"/>
                     </a:xfrm>
                     <a:prstGeom prst="rect">
                       <a:avLst/>
@@ -2490,20 +2738,20 @@
       <w:r>
         <w:drawing>
           <wp:inline>
-            <wp:extent cx="5943600" cy="2518474"/>
+            <wp:extent cx="4519338" cy="1914973"/>
             <wp:effectExtent b="0" l="0" r="0" t="0"/>
-            <wp:docPr descr="Escritorio: menú del paseador (solo Paseos)" title="" id="1008" name="Picture"/>
+            <wp:docPr descr="Escritorio: menú del paseador (solo Paseos)" title="" id="30" name="Picture"/>
             <a:graphic>
               <a:graphicData uri="http://schemas.openxmlformats.org/drawingml/2006/picture">
                 <pic:pic>
                   <pic:nvPicPr>
-                    <pic:cNvPr descr="capturas/esc-menu-paseador.png" id="1009" name="Picture"/>
+                    <pic:cNvPr descr="capturas/esc-menu-paseador.png" id="31" name="Picture"/>
                     <pic:cNvPicPr>
                       <a:picLocks noChangeArrowheads="1" noChangeAspect="1"/>
                     </pic:cNvPicPr>
                   </pic:nvPicPr>
                   <pic:blipFill>
-                    <a:blip r:embed="rIdCap9"/>
+                    <a:blip r:embed="rId29"/>
                     <a:stretch>
                       <a:fillRect/>
                     </a:stretch>
@@ -2511,7 +2759,7 @@
                   <pic:spPr bwMode="auto">
                     <a:xfrm>
                       <a:off x="0" y="0"/>
-                      <a:ext cx="5943600" cy="2518474"/>
+                      <a:ext cx="4519338" cy="1914973"/>
                     </a:xfrm>
                     <a:prstGeom prst="rect">
                       <a:avLst/>
@@ -2545,20 +2793,20 @@
       <w:r>
         <w:drawing>
           <wp:inline>
-            <wp:extent cx="5943600" cy="4246065"/>
+            <wp:extent cx="5334000" cy="3810571"/>
             <wp:effectExtent b="0" l="0" r="0" t="0"/>
-            <wp:docPr descr="Escritorio: ABMC de dueños" title="" id="1010" name="Picture"/>
+            <wp:docPr descr="Escritorio: ABMC de dueños" title="" id="33" name="Picture"/>
             <a:graphic>
               <a:graphicData uri="http://schemas.openxmlformats.org/drawingml/2006/picture">
                 <pic:pic>
                   <pic:nvPicPr>
-                    <pic:cNvPr descr="capturas/esc-duenos-admin.png" id="1011" name="Picture"/>
+                    <pic:cNvPr descr="capturas/esc-duenos-admin.png" id="34" name="Picture"/>
                     <pic:cNvPicPr>
                       <a:picLocks noChangeArrowheads="1" noChangeAspect="1"/>
                     </pic:cNvPicPr>
                   </pic:nvPicPr>
                   <pic:blipFill>
-                    <a:blip r:embed="rIdCap11"/>
+                    <a:blip r:embed="rId32"/>
                     <a:stretch>
                       <a:fillRect/>
                     </a:stretch>
@@ -2566,7 +2814,7 @@
                   <pic:spPr bwMode="auto">
                     <a:xfrm>
                       <a:off x="0" y="0"/>
-                      <a:ext cx="5943600" cy="4246065"/>
+                      <a:ext cx="5334000" cy="3810571"/>
                     </a:xfrm>
                     <a:prstGeom prst="rect">
                       <a:avLst/>
@@ -2600,20 +2848,20 @@
       <w:r>
         <w:drawing>
           <wp:inline>
-            <wp:extent cx="5943600" cy="4758444"/>
+            <wp:extent cx="5334000" cy="4270398"/>
             <wp:effectExtent b="0" l="0" r="0" t="0"/>
-            <wp:docPr descr="Escritorio: ABMC de paseadores" title="" id="1012" name="Picture"/>
+            <wp:docPr descr="Escritorio: ABMC de paseadores" title="" id="36" name="Picture"/>
             <a:graphic>
               <a:graphicData uri="http://schemas.openxmlformats.org/drawingml/2006/picture">
                 <pic:pic>
                   <pic:nvPicPr>
-                    <pic:cNvPr descr="capturas/esc-paseadores-admin.png" id="1013" name="Picture"/>
+                    <pic:cNvPr descr="capturas/esc-paseadores-admin.png" id="37" name="Picture"/>
                     <pic:cNvPicPr>
                       <a:picLocks noChangeArrowheads="1" noChangeAspect="1"/>
                     </pic:cNvPicPr>
                   </pic:nvPicPr>
                   <pic:blipFill>
-                    <a:blip r:embed="rIdCap13"/>
+                    <a:blip r:embed="rId35"/>
                     <a:stretch>
                       <a:fillRect/>
                     </a:stretch>
@@ -2621,7 +2869,7 @@
                   <pic:spPr bwMode="auto">
                     <a:xfrm>
                       <a:off x="0" y="0"/>
-                      <a:ext cx="5943600" cy="4758444"/>
+                      <a:ext cx="5334000" cy="4270398"/>
                     </a:xfrm>
                     <a:prstGeom prst="rect">
                       <a:avLst/>
@@ -2655,20 +2903,20 @@
       <w:r>
         <w:drawing>
           <wp:inline>
-            <wp:extent cx="5943600" cy="3978736"/>
+            <wp:extent cx="5334000" cy="3570661"/>
             <wp:effectExtent b="0" l="0" r="0" t="0"/>
-            <wp:docPr descr="Escritorio: ABMC de perros (administrador)" title="" id="1014" name="Picture"/>
+            <wp:docPr descr="Escritorio: ABMC de perros (administrador)" title="" id="39" name="Picture"/>
             <a:graphic>
               <a:graphicData uri="http://schemas.openxmlformats.org/drawingml/2006/picture">
                 <pic:pic>
                   <pic:nvPicPr>
-                    <pic:cNvPr descr="capturas/esc-perros-admin.png" id="1015" name="Picture"/>
+                    <pic:cNvPr descr="capturas/esc-perros-admin.png" id="40" name="Picture"/>
                     <pic:cNvPicPr>
                       <a:picLocks noChangeArrowheads="1" noChangeAspect="1"/>
                     </pic:cNvPicPr>
                   </pic:nvPicPr>
                   <pic:blipFill>
-                    <a:blip r:embed="rIdCap15"/>
+                    <a:blip r:embed="rId38"/>
                     <a:stretch>
                       <a:fillRect/>
                     </a:stretch>
@@ -2676,7 +2924,7 @@
                   <pic:spPr bwMode="auto">
                     <a:xfrm>
                       <a:off x="0" y="0"/>
-                      <a:ext cx="5943600" cy="3978736"/>
+                      <a:ext cx="5334000" cy="3570661"/>
                     </a:xfrm>
                     <a:prstGeom prst="rect">
                       <a:avLst/>
@@ -2710,20 +2958,20 @@
       <w:r>
         <w:drawing>
           <wp:inline>
-            <wp:extent cx="5943600" cy="3978736"/>
+            <wp:extent cx="5334000" cy="3570661"/>
             <wp:effectExtent b="0" l="0" r="0" t="0"/>
-            <wp:docPr descr="Escritorio: perros vistos por un dueño (solo los suyos, con el dueño fijo)" title="" id="1016" name="Picture"/>
+            <wp:docPr descr="Escritorio: perros vistos por un dueño (solo los suyos, con el dueño fijo)" title="" id="42" name="Picture"/>
             <a:graphic>
               <a:graphicData uri="http://schemas.openxmlformats.org/drawingml/2006/picture">
                 <pic:pic>
                   <pic:nvPicPr>
-                    <pic:cNvPr descr="capturas/esc-perros-dueno.png" id="1017" name="Picture"/>
+                    <pic:cNvPr descr="capturas/esc-perros-dueno.png" id="43" name="Picture"/>
                     <pic:cNvPicPr>
                       <a:picLocks noChangeArrowheads="1" noChangeAspect="1"/>
                     </pic:cNvPicPr>
                   </pic:nvPicPr>
                   <pic:blipFill>
-                    <a:blip r:embed="rIdCap17"/>
+                    <a:blip r:embed="rId41"/>
                     <a:stretch>
                       <a:fillRect/>
                     </a:stretch>
@@ -2731,7 +2979,7 @@
                   <pic:spPr bwMode="auto">
                     <a:xfrm>
                       <a:off x="0" y="0"/>
-                      <a:ext cx="5943600" cy="3978736"/>
+                      <a:ext cx="5334000" cy="3570661"/>
                     </a:xfrm>
                     <a:prstGeom prst="rect">
                       <a:avLst/>
@@ -2765,20 +3013,20 @@
       <w:r>
         <w:drawing>
           <wp:inline>
-            <wp:extent cx="5943600" cy="3978736"/>
+            <wp:extent cx="5334000" cy="3570661"/>
             <wp:effectExtent b="0" l="0" r="0" t="0"/>
-            <wp:docPr descr="Escritorio: ABMC de paseos (administrador)" title="" id="1018" name="Picture"/>
+            <wp:docPr descr="Escritorio: ABMC de paseos (administrador)" title="" id="45" name="Picture"/>
             <a:graphic>
               <a:graphicData uri="http://schemas.openxmlformats.org/drawingml/2006/picture">
                 <pic:pic>
                   <pic:nvPicPr>
-                    <pic:cNvPr descr="capturas/esc-paseos-admin.png" id="1019" name="Picture"/>
+                    <pic:cNvPr descr="capturas/esc-paseos-admin.png" id="46" name="Picture"/>
                     <pic:cNvPicPr>
                       <a:picLocks noChangeArrowheads="1" noChangeAspect="1"/>
                     </pic:cNvPicPr>
                   </pic:nvPicPr>
                   <pic:blipFill>
-                    <a:blip r:embed="rIdCap19"/>
+                    <a:blip r:embed="rId44"/>
                     <a:stretch>
                       <a:fillRect/>
                     </a:stretch>
@@ -2786,7 +3034,7 @@
                   <pic:spPr bwMode="auto">
                     <a:xfrm>
                       <a:off x="0" y="0"/>
-                      <a:ext cx="5943600" cy="3978736"/>
+                      <a:ext cx="5334000" cy="3570661"/>
                     </a:xfrm>
                     <a:prstGeom prst="rect">
                       <a:avLst/>
@@ -2820,20 +3068,20 @@
       <w:r>
         <w:drawing>
           <wp:inline>
-            <wp:extent cx="5943600" cy="3978736"/>
+            <wp:extent cx="5334000" cy="3570661"/>
             <wp:effectExtent b="0" l="0" r="0" t="0"/>
-            <wp:docPr descr="Escritorio: búsqueda de paseos filtrando por paseador y rango de fechas" title="" id="1020" name="Picture"/>
+            <wp:docPr descr="Escritorio: búsqueda de paseos filtrando por paseador y rango de fechas" title="" id="48" name="Picture"/>
             <a:graphic>
               <a:graphicData uri="http://schemas.openxmlformats.org/drawingml/2006/picture">
                 <pic:pic>
                   <pic:nvPicPr>
-                    <pic:cNvPr descr="capturas/esc-paseos-admin-filtro.png" id="1021" name="Picture"/>
+                    <pic:cNvPr descr="capturas/esc-paseos-admin-filtro.png" id="49" name="Picture"/>
                     <pic:cNvPicPr>
                       <a:picLocks noChangeArrowheads="1" noChangeAspect="1"/>
                     </pic:cNvPicPr>
                   </pic:nvPicPr>
                   <pic:blipFill>
-                    <a:blip r:embed="rIdCap21"/>
+                    <a:blip r:embed="rId47"/>
                     <a:stretch>
                       <a:fillRect/>
                     </a:stretch>
@@ -2841,7 +3089,7 @@
                   <pic:spPr bwMode="auto">
                     <a:xfrm>
                       <a:off x="0" y="0"/>
-                      <a:ext cx="5943600" cy="3978736"/>
+                      <a:ext cx="5334000" cy="3570661"/>
                     </a:xfrm>
                     <a:prstGeom prst="rect">
                       <a:avLst/>
@@ -2875,20 +3123,20 @@
       <w:r>
         <w:drawing>
           <wp:inline>
-            <wp:extent cx="5943600" cy="3978736"/>
+            <wp:extent cx="5334000" cy="3570661"/>
             <wp:effectExtent b="0" l="0" r="0" t="0"/>
-            <wp:docPr descr="Escritorio: paseos vistos por un dueño (solo los de sus perros)" title="" id="1022" name="Picture"/>
+            <wp:docPr descr="Escritorio: paseos vistos por un dueño (solo los de sus perros)" title="" id="51" name="Picture"/>
             <a:graphic>
               <a:graphicData uri="http://schemas.openxmlformats.org/drawingml/2006/picture">
                 <pic:pic>
                   <pic:nvPicPr>
-                    <pic:cNvPr descr="capturas/esc-paseos-dueno.png" id="1023" name="Picture"/>
+                    <pic:cNvPr descr="capturas/esc-paseos-dueno.png" id="52" name="Picture"/>
                     <pic:cNvPicPr>
                       <a:picLocks noChangeArrowheads="1" noChangeAspect="1"/>
                     </pic:cNvPicPr>
                   </pic:nvPicPr>
                   <pic:blipFill>
-                    <a:blip r:embed="rIdCap23"/>
+                    <a:blip r:embed="rId50"/>
                     <a:stretch>
                       <a:fillRect/>
                     </a:stretch>
@@ -2896,7 +3144,7 @@
                   <pic:spPr bwMode="auto">
                     <a:xfrm>
                       <a:off x="0" y="0"/>
-                      <a:ext cx="5943600" cy="3978736"/>
+                      <a:ext cx="5334000" cy="3570661"/>
                     </a:xfrm>
                     <a:prstGeom prst="rect">
                       <a:avLst/>
@@ -2930,20 +3178,20 @@
       <w:r>
         <w:drawing>
           <wp:inline>
-            <wp:extent cx="5943600" cy="3978736"/>
+            <wp:extent cx="5334000" cy="3570661"/>
             <wp:effectExtent b="0" l="0" r="0" t="0"/>
-            <wp:docPr descr="Escritorio: paseos vistos por un paseador (solo los suyos)" title="" id="1024" name="Picture"/>
+            <wp:docPr descr="Escritorio: paseos vistos por un paseador (solo los suyos)" title="" id="54" name="Picture"/>
             <a:graphic>
               <a:graphicData uri="http://schemas.openxmlformats.org/drawingml/2006/picture">
                 <pic:pic>
                   <pic:nvPicPr>
-                    <pic:cNvPr descr="capturas/esc-paseos-paseador.png" id="1025" name="Picture"/>
+                    <pic:cNvPr descr="capturas/esc-paseos-paseador.png" id="55" name="Picture"/>
                     <pic:cNvPicPr>
                       <a:picLocks noChangeArrowheads="1" noChangeAspect="1"/>
                     </pic:cNvPicPr>
                   </pic:nvPicPr>
                   <pic:blipFill>
-                    <a:blip r:embed="rIdCap25"/>
+                    <a:blip r:embed="rId53"/>
                     <a:stretch>
                       <a:fillRect/>
                     </a:stretch>
@@ -2951,7 +3199,7 @@
                   <pic:spPr bwMode="auto">
                     <a:xfrm>
                       <a:off x="0" y="0"/>
-                      <a:ext cx="5943600" cy="3978736"/>
+                      <a:ext cx="5334000" cy="3570661"/>
                     </a:xfrm>
                     <a:prstGeom prst="rect">
                       <a:avLst/>
@@ -2985,20 +3233,20 @@
       <w:r>
         <w:drawing>
           <wp:inline>
-            <wp:extent cx="5943600" cy="4246065"/>
+            <wp:extent cx="5334000" cy="3810571"/>
             <wp:effectExtent b="0" l="0" r="0" t="0"/>
-            <wp:docPr descr="Escritorio: ABMC de administradores" title="" id="1026" name="Picture"/>
+            <wp:docPr descr="Escritorio: ABMC de administradores" title="" id="57" name="Picture"/>
             <a:graphic>
               <a:graphicData uri="http://schemas.openxmlformats.org/drawingml/2006/picture">
                 <pic:pic>
                   <pic:nvPicPr>
-                    <pic:cNvPr descr="capturas/esc-administradores-admin.png" id="1027" name="Picture"/>
+                    <pic:cNvPr descr="capturas/esc-administradores-admin.png" id="58" name="Picture"/>
                     <pic:cNvPicPr>
                       <a:picLocks noChangeArrowheads="1" noChangeAspect="1"/>
                     </pic:cNvPicPr>
                   </pic:nvPicPr>
                   <pic:blipFill>
-                    <a:blip r:embed="rIdCap27"/>
+                    <a:blip r:embed="rId56"/>
                     <a:stretch>
                       <a:fillRect/>
                     </a:stretch>
@@ -3006,7 +3254,7 @@
                   <pic:spPr bwMode="auto">
                     <a:xfrm>
                       <a:off x="0" y="0"/>
-                      <a:ext cx="5943600" cy="4246065"/>
+                      <a:ext cx="5334000" cy="3810571"/>
                     </a:xfrm>
                     <a:prstGeom prst="rect">
                       <a:avLst/>
@@ -3040,20 +3288,20 @@
       <w:r>
         <w:drawing>
           <wp:inline>
-            <wp:extent cx="5943600" cy="5002384"/>
+            <wp:extent cx="5334000" cy="4489319"/>
             <wp:effectExtent b="0" l="0" r="0" t="0"/>
-            <wp:docPr descr="Escritorio: liquidaciones registradas (maestro)" title="" id="1028" name="Picture"/>
+            <wp:docPr descr="Escritorio: liquidaciones registradas (maestro)" title="" id="60" name="Picture"/>
             <a:graphic>
               <a:graphicData uri="http://schemas.openxmlformats.org/drawingml/2006/picture">
                 <pic:pic>
                   <pic:nvPicPr>
-                    <pic:cNvPr descr="capturas/esc-liquidaciones-lista.png" id="1029" name="Picture"/>
+                    <pic:cNvPr descr="capturas/esc-liquidaciones-lista.png" id="61" name="Picture"/>
                     <pic:cNvPicPr>
                       <a:picLocks noChangeArrowheads="1" noChangeAspect="1"/>
                     </pic:cNvPicPr>
                   </pic:nvPicPr>
                   <pic:blipFill>
-                    <a:blip r:embed="rIdCap29"/>
+                    <a:blip r:embed="rId59"/>
                     <a:stretch>
                       <a:fillRect/>
                     </a:stretch>
@@ -3061,7 +3309,7 @@
                   <pic:spPr bwMode="auto">
                     <a:xfrm>
                       <a:off x="0" y="0"/>
-                      <a:ext cx="5943600" cy="5002384"/>
+                      <a:ext cx="5334000" cy="4489319"/>
                     </a:xfrm>
                     <a:prstGeom prst="rect">
                       <a:avLst/>
@@ -3095,20 +3343,20 @@
       <w:r>
         <w:drawing>
           <wp:inline>
-            <wp:extent cx="5943600" cy="5002384"/>
+            <wp:extent cx="5334000" cy="4489319"/>
             <wp:effectExtent b="0" l="0" r="0" t="0"/>
-            <wp:docPr descr="Escritorio: edición de una liquidación (cabecera, paseos pendientes y detalle con el total)" title="" id="1030" name="Picture"/>
+            <wp:docPr descr="Escritorio: edición de una liquidación (cabecera, paseos pendientes y detalle con el total)" title="" id="63" name="Picture"/>
             <a:graphic>
               <a:graphicData uri="http://schemas.openxmlformats.org/drawingml/2006/picture">
                 <pic:pic>
                   <pic:nvPicPr>
-                    <pic:cNvPr descr="capturas/esc-liquidaciones-detalle.png" id="1031" name="Picture"/>
+                    <pic:cNvPr descr="capturas/esc-liquidaciones-detalle.png" id="64" name="Picture"/>
                     <pic:cNvPicPr>
                       <a:picLocks noChangeArrowheads="1" noChangeAspect="1"/>
                     </pic:cNvPicPr>
                   </pic:nvPicPr>
                   <pic:blipFill>
-                    <a:blip r:embed="rIdCap31"/>
+                    <a:blip r:embed="rId62"/>
                     <a:stretch>
                       <a:fillRect/>
                     </a:stretch>
@@ -3116,7 +3364,7 @@
                   <pic:spPr bwMode="auto">
                     <a:xfrm>
                       <a:off x="0" y="0"/>
-                      <a:ext cx="5943600" cy="5002384"/>
+                      <a:ext cx="5334000" cy="4489319"/>
                     </a:xfrm>
                     <a:prstGeom prst="rect">
                       <a:avLst/>
@@ -3143,8 +3391,8 @@
         <w:t xml:space="preserve">Escritorio: edición de una liquidación (cabecera, paseos pendientes y detalle con el total)</w:t>
       </w:r>
     </w:p>
-    <w:bookmarkEnd w:id="17"/>
-    <w:bookmarkStart w:id="18" w:name="aplicación-web"/>
+    <w:bookmarkEnd w:id="65"/>
+    <w:bookmarkStart w:id="108" w:name="aplicación-web"/>
     <w:p>
       <w:pPr>
         <w:pStyle w:val="Heading2"/>
@@ -3168,20 +3416,20 @@
       <w:r>
         <w:drawing>
           <wp:inline>
-            <wp:extent cx="3200400" cy="1973580"/>
+            <wp:extent cx="5334000" cy="3289300"/>
             <wp:effectExtent b="0" l="0" r="0" t="0"/>
-            <wp:docPr descr="Web: inicio de sesión" title="" id="1032" name="Picture"/>
+            <wp:docPr descr="Web: inicio de sesión" title="" id="67" name="Picture"/>
             <a:graphic>
               <a:graphicData uri="http://schemas.openxmlformats.org/drawingml/2006/picture">
                 <pic:pic>
                   <pic:nvPicPr>
-                    <pic:cNvPr descr="capturas/web-01-login.png" id="1033" name="Picture"/>
+                    <pic:cNvPr descr="capturas/web-01-login.png" id="68" name="Picture"/>
                     <pic:cNvPicPr>
                       <a:picLocks noChangeArrowheads="1" noChangeAspect="1"/>
                     </pic:cNvPicPr>
                   </pic:nvPicPr>
                   <pic:blipFill>
-                    <a:blip r:embed="rIdCap33"/>
+                    <a:blip r:embed="rId66"/>
                     <a:stretch>
                       <a:fillRect/>
                     </a:stretch>
@@ -3189,7 +3437,7 @@
                   <pic:spPr bwMode="auto">
                     <a:xfrm>
                       <a:off x="0" y="0"/>
-                      <a:ext cx="3200400" cy="1973580"/>
+                      <a:ext cx="5334000" cy="3289300"/>
                     </a:xfrm>
                     <a:prstGeom prst="rect">
                       <a:avLst/>
@@ -3223,20 +3471,20 @@
       <w:r>
         <w:drawing>
           <wp:inline>
-            <wp:extent cx="5943600" cy="4127500"/>
+            <wp:extent cx="5334000" cy="3704166"/>
             <wp:effectExtent b="0" l="0" r="0" t="0"/>
-            <wp:docPr descr="Web: menú del administrador" title="" id="1034" name="Picture"/>
+            <wp:docPr descr="Web: menú del administrador" title="" id="70" name="Picture"/>
             <a:graphic>
               <a:graphicData uri="http://schemas.openxmlformats.org/drawingml/2006/picture">
                 <pic:pic>
                   <pic:nvPicPr>
-                    <pic:cNvPr descr="capturas/web-inicio-admin.png" id="1035" name="Picture"/>
+                    <pic:cNvPr descr="capturas/web-inicio-admin.png" id="71" name="Picture"/>
                     <pic:cNvPicPr>
                       <a:picLocks noChangeArrowheads="1" noChangeAspect="1"/>
                     </pic:cNvPicPr>
                   </pic:nvPicPr>
                   <pic:blipFill>
-                    <a:blip r:embed="rIdCap35"/>
+                    <a:blip r:embed="rId69"/>
                     <a:stretch>
                       <a:fillRect/>
                     </a:stretch>
@@ -3244,7 +3492,7 @@
                   <pic:spPr bwMode="auto">
                     <a:xfrm>
                       <a:off x="0" y="0"/>
-                      <a:ext cx="5943600" cy="4127500"/>
+                      <a:ext cx="5334000" cy="3704166"/>
                     </a:xfrm>
                     <a:prstGeom prst="rect">
                       <a:avLst/>
@@ -3278,20 +3526,20 @@
       <w:r>
         <w:drawing>
           <wp:inline>
-            <wp:extent cx="5943600" cy="4127500"/>
+            <wp:extent cx="5334000" cy="3704166"/>
             <wp:effectExtent b="0" l="0" r="0" t="0"/>
-            <wp:docPr descr="Web: menú del dueño" title="" id="1036" name="Picture"/>
+            <wp:docPr descr="Web: menú del dueño" title="" id="73" name="Picture"/>
             <a:graphic>
               <a:graphicData uri="http://schemas.openxmlformats.org/drawingml/2006/picture">
                 <pic:pic>
                   <pic:nvPicPr>
-                    <pic:cNvPr descr="capturas/web-inicio-dueno.png" id="1037" name="Picture"/>
+                    <pic:cNvPr descr="capturas/web-inicio-dueno.png" id="74" name="Picture"/>
                     <pic:cNvPicPr>
                       <a:picLocks noChangeArrowheads="1" noChangeAspect="1"/>
                     </pic:cNvPicPr>
                   </pic:nvPicPr>
                   <pic:blipFill>
-                    <a:blip r:embed="rIdCap37"/>
+                    <a:blip r:embed="rId72"/>
                     <a:stretch>
                       <a:fillRect/>
                     </a:stretch>
@@ -3299,7 +3547,7 @@
                   <pic:spPr bwMode="auto">
                     <a:xfrm>
                       <a:off x="0" y="0"/>
-                      <a:ext cx="5943600" cy="4127500"/>
+                      <a:ext cx="5334000" cy="3704166"/>
                     </a:xfrm>
                     <a:prstGeom prst="rect">
                       <a:avLst/>
@@ -3333,20 +3581,20 @@
       <w:r>
         <w:drawing>
           <wp:inline>
-            <wp:extent cx="5943600" cy="4127500"/>
+            <wp:extent cx="5334000" cy="3704166"/>
             <wp:effectExtent b="0" l="0" r="0" t="0"/>
-            <wp:docPr descr="Web: menú del paseador" title="" id="1038" name="Picture"/>
+            <wp:docPr descr="Web: menú del paseador" title="" id="76" name="Picture"/>
             <a:graphic>
               <a:graphicData uri="http://schemas.openxmlformats.org/drawingml/2006/picture">
                 <pic:pic>
                   <pic:nvPicPr>
-                    <pic:cNvPr descr="capturas/web-inicio-paseador.png" id="1039" name="Picture"/>
+                    <pic:cNvPr descr="capturas/web-inicio-paseador.png" id="77" name="Picture"/>
                     <pic:cNvPicPr>
                       <a:picLocks noChangeArrowheads="1" noChangeAspect="1"/>
                     </pic:cNvPicPr>
                   </pic:nvPicPr>
                   <pic:blipFill>
-                    <a:blip r:embed="rIdCap39"/>
+                    <a:blip r:embed="rId75"/>
                     <a:stretch>
                       <a:fillRect/>
                     </a:stretch>
@@ -3354,7 +3602,7 @@
                   <pic:spPr bwMode="auto">
                     <a:xfrm>
                       <a:off x="0" y="0"/>
-                      <a:ext cx="5943600" cy="4127500"/>
+                      <a:ext cx="5334000" cy="3704166"/>
                     </a:xfrm>
                     <a:prstGeom prst="rect">
                       <a:avLst/>
@@ -3388,20 +3636,20 @@
       <w:r>
         <w:drawing>
           <wp:inline>
-            <wp:extent cx="5943600" cy="4127500"/>
+            <wp:extent cx="5334000" cy="3704166"/>
             <wp:effectExtent b="0" l="0" r="0" t="0"/>
-            <wp:docPr descr="Web: ABMC de dueños" title="" id="1040" name="Picture"/>
+            <wp:docPr descr="Web: ABMC de dueños" title="" id="79" name="Picture"/>
             <a:graphic>
               <a:graphicData uri="http://schemas.openxmlformats.org/drawingml/2006/picture">
                 <pic:pic>
                   <pic:nvPicPr>
-                    <pic:cNvPr descr="capturas/web-duenos-admin.png" id="1041" name="Picture"/>
+                    <pic:cNvPr descr="capturas/web-duenos-admin.png" id="80" name="Picture"/>
                     <pic:cNvPicPr>
                       <a:picLocks noChangeArrowheads="1" noChangeAspect="1"/>
                     </pic:cNvPicPr>
                   </pic:nvPicPr>
                   <pic:blipFill>
-                    <a:blip r:embed="rIdCap41"/>
+                    <a:blip r:embed="rId78"/>
                     <a:stretch>
                       <a:fillRect/>
                     </a:stretch>
@@ -3409,7 +3657,7 @@
                   <pic:spPr bwMode="auto">
                     <a:xfrm>
                       <a:off x="0" y="0"/>
-                      <a:ext cx="5943600" cy="4127500"/>
+                      <a:ext cx="5334000" cy="3704166"/>
                     </a:xfrm>
                     <a:prstGeom prst="rect">
                       <a:avLst/>
@@ -3443,20 +3691,20 @@
       <w:r>
         <w:drawing>
           <wp:inline>
-            <wp:extent cx="5943600" cy="4127500"/>
+            <wp:extent cx="5334000" cy="3704166"/>
             <wp:effectExtent b="0" l="0" r="0" t="0"/>
-            <wp:docPr descr="Web: ABMC de paseadores" title="" id="1042" name="Picture"/>
+            <wp:docPr descr="Web: ABMC de paseadores" title="" id="82" name="Picture"/>
             <a:graphic>
               <a:graphicData uri="http://schemas.openxmlformats.org/drawingml/2006/picture">
                 <pic:pic>
                   <pic:nvPicPr>
-                    <pic:cNvPr descr="capturas/web-paseadores-admin.png" id="1043" name="Picture"/>
+                    <pic:cNvPr descr="capturas/web-paseadores-admin.png" id="83" name="Picture"/>
                     <pic:cNvPicPr>
                       <a:picLocks noChangeArrowheads="1" noChangeAspect="1"/>
                     </pic:cNvPicPr>
                   </pic:nvPicPr>
                   <pic:blipFill>
-                    <a:blip r:embed="rIdCap43"/>
+                    <a:blip r:embed="rId81"/>
                     <a:stretch>
                       <a:fillRect/>
                     </a:stretch>
@@ -3464,7 +3712,7 @@
                   <pic:spPr bwMode="auto">
                     <a:xfrm>
                       <a:off x="0" y="0"/>
-                      <a:ext cx="5943600" cy="4127500"/>
+                      <a:ext cx="5334000" cy="3704166"/>
                     </a:xfrm>
                     <a:prstGeom prst="rect">
                       <a:avLst/>
@@ -3498,20 +3746,20 @@
       <w:r>
         <w:drawing>
           <wp:inline>
-            <wp:extent cx="5943600" cy="4127500"/>
+            <wp:extent cx="5334000" cy="3704166"/>
             <wp:effectExtent b="0" l="0" r="0" t="0"/>
-            <wp:docPr descr="Web: ABMC de perros (administrador)" title="" id="1044" name="Picture"/>
+            <wp:docPr descr="Web: ABMC de perros (administrador)" title="" id="85" name="Picture"/>
             <a:graphic>
               <a:graphicData uri="http://schemas.openxmlformats.org/drawingml/2006/picture">
                 <pic:pic>
                   <pic:nvPicPr>
-                    <pic:cNvPr descr="capturas/web-perros-admin.png" id="1045" name="Picture"/>
+                    <pic:cNvPr descr="capturas/web-perros-admin.png" id="86" name="Picture"/>
                     <pic:cNvPicPr>
                       <a:picLocks noChangeArrowheads="1" noChangeAspect="1"/>
                     </pic:cNvPicPr>
                   </pic:nvPicPr>
                   <pic:blipFill>
-                    <a:blip r:embed="rIdCap45"/>
+                    <a:blip r:embed="rId84"/>
                     <a:stretch>
                       <a:fillRect/>
                     </a:stretch>
@@ -3519,7 +3767,7 @@
                   <pic:spPr bwMode="auto">
                     <a:xfrm>
                       <a:off x="0" y="0"/>
-                      <a:ext cx="5943600" cy="4127500"/>
+                      <a:ext cx="5334000" cy="3704166"/>
                     </a:xfrm>
                     <a:prstGeom prst="rect">
                       <a:avLst/>
@@ -3553,20 +3801,20 @@
       <w:r>
         <w:drawing>
           <wp:inline>
-            <wp:extent cx="5943600" cy="4127500"/>
+            <wp:extent cx="5334000" cy="3704166"/>
             <wp:effectExtent b="0" l="0" r="0" t="0"/>
-            <wp:docPr descr="Web: perros vistos por un dueño" title="" id="1046" name="Picture"/>
+            <wp:docPr descr="Web: perros vistos por un dueño" title="" id="88" name="Picture"/>
             <a:graphic>
               <a:graphicData uri="http://schemas.openxmlformats.org/drawingml/2006/picture">
                 <pic:pic>
                   <pic:nvPicPr>
-                    <pic:cNvPr descr="capturas/web-perros-dueno.png" id="1047" name="Picture"/>
+                    <pic:cNvPr descr="capturas/web-perros-dueno.png" id="89" name="Picture"/>
                     <pic:cNvPicPr>
                       <a:picLocks noChangeArrowheads="1" noChangeAspect="1"/>
                     </pic:cNvPicPr>
                   </pic:nvPicPr>
                   <pic:blipFill>
-                    <a:blip r:embed="rIdCap47"/>
+                    <a:blip r:embed="rId87"/>
                     <a:stretch>
                       <a:fillRect/>
                     </a:stretch>
@@ -3574,7 +3822,7 @@
                   <pic:spPr bwMode="auto">
                     <a:xfrm>
                       <a:off x="0" y="0"/>
-                      <a:ext cx="5943600" cy="4127500"/>
+                      <a:ext cx="5334000" cy="3704166"/>
                     </a:xfrm>
                     <a:prstGeom prst="rect">
                       <a:avLst/>
@@ -3608,20 +3856,20 @@
       <w:r>
         <w:drawing>
           <wp:inline>
-            <wp:extent cx="5943600" cy="5159375"/>
+            <wp:extent cx="5334000" cy="4630208"/>
             <wp:effectExtent b="0" l="0" r="0" t="0"/>
-            <wp:docPr descr="Web: ABMC de paseos (administrador)" title="" id="1048" name="Picture"/>
+            <wp:docPr descr="Web: ABMC de paseos (administrador)" title="" id="91" name="Picture"/>
             <a:graphic>
               <a:graphicData uri="http://schemas.openxmlformats.org/drawingml/2006/picture">
                 <pic:pic>
                   <pic:nvPicPr>
-                    <pic:cNvPr descr="capturas/web-paseos-admin.png" id="1049" name="Picture"/>
+                    <pic:cNvPr descr="capturas/web-paseos-admin.png" id="92" name="Picture"/>
                     <pic:cNvPicPr>
                       <a:picLocks noChangeArrowheads="1" noChangeAspect="1"/>
                     </pic:cNvPicPr>
                   </pic:nvPicPr>
                   <pic:blipFill>
-                    <a:blip r:embed="rIdCap49"/>
+                    <a:blip r:embed="rId90"/>
                     <a:stretch>
                       <a:fillRect/>
                     </a:stretch>
@@ -3629,7 +3877,7 @@
                   <pic:spPr bwMode="auto">
                     <a:xfrm>
                       <a:off x="0" y="0"/>
-                      <a:ext cx="5943600" cy="5159375"/>
+                      <a:ext cx="5334000" cy="4630208"/>
                     </a:xfrm>
                     <a:prstGeom prst="rect">
                       <a:avLst/>
@@ -3663,20 +3911,20 @@
       <w:r>
         <w:drawing>
           <wp:inline>
-            <wp:extent cx="5943600" cy="5159375"/>
+            <wp:extent cx="5334000" cy="4630208"/>
             <wp:effectExtent b="0" l="0" r="0" t="0"/>
-            <wp:docPr descr="Web: búsqueda de paseos filtrando por paseador y rango de fechas" title="" id="1050" name="Picture"/>
+            <wp:docPr descr="Web: búsqueda de paseos filtrando por paseador y rango de fechas" title="" id="94" name="Picture"/>
             <a:graphic>
               <a:graphicData uri="http://schemas.openxmlformats.org/drawingml/2006/picture">
                 <pic:pic>
                   <pic:nvPicPr>
-                    <pic:cNvPr descr="capturas/web-paseos-admin-filtro.png" id="1051" name="Picture"/>
+                    <pic:cNvPr descr="capturas/web-paseos-admin-filtro.png" id="95" name="Picture"/>
                     <pic:cNvPicPr>
                       <a:picLocks noChangeArrowheads="1" noChangeAspect="1"/>
                     </pic:cNvPicPr>
                   </pic:nvPicPr>
                   <pic:blipFill>
-                    <a:blip r:embed="rIdCap51"/>
+                    <a:blip r:embed="rId93"/>
                     <a:stretch>
                       <a:fillRect/>
                     </a:stretch>
@@ -3684,7 +3932,7 @@
                   <pic:spPr bwMode="auto">
                     <a:xfrm>
                       <a:off x="0" y="0"/>
-                      <a:ext cx="5943600" cy="5159375"/>
+                      <a:ext cx="5334000" cy="4630208"/>
                     </a:xfrm>
                     <a:prstGeom prst="rect">
                       <a:avLst/>
@@ -3718,20 +3966,20 @@
       <w:r>
         <w:drawing>
           <wp:inline>
-            <wp:extent cx="5943600" cy="5159375"/>
+            <wp:extent cx="5334000" cy="4630208"/>
             <wp:effectExtent b="0" l="0" r="0" t="0"/>
-            <wp:docPr descr="Web: paseos vistos por un dueño" title="" id="1052" name="Picture"/>
+            <wp:docPr descr="Web: paseos vistos por un dueño" title="" id="97" name="Picture"/>
             <a:graphic>
               <a:graphicData uri="http://schemas.openxmlformats.org/drawingml/2006/picture">
                 <pic:pic>
                   <pic:nvPicPr>
-                    <pic:cNvPr descr="capturas/web-paseos-dueno.png" id="1053" name="Picture"/>
+                    <pic:cNvPr descr="capturas/web-paseos-dueno.png" id="98" name="Picture"/>
                     <pic:cNvPicPr>
                       <a:picLocks noChangeArrowheads="1" noChangeAspect="1"/>
                     </pic:cNvPicPr>
                   </pic:nvPicPr>
                   <pic:blipFill>
-                    <a:blip r:embed="rIdCap53"/>
+                    <a:blip r:embed="rId96"/>
                     <a:stretch>
                       <a:fillRect/>
                     </a:stretch>
@@ -3739,7 +3987,7 @@
                   <pic:spPr bwMode="auto">
                     <a:xfrm>
                       <a:off x="0" y="0"/>
-                      <a:ext cx="5943600" cy="5159375"/>
+                      <a:ext cx="5334000" cy="4630208"/>
                     </a:xfrm>
                     <a:prstGeom prst="rect">
                       <a:avLst/>
@@ -3773,20 +4021,20 @@
       <w:r>
         <w:drawing>
           <wp:inline>
-            <wp:extent cx="5943600" cy="5159375"/>
+            <wp:extent cx="5334000" cy="4630208"/>
             <wp:effectExtent b="0" l="0" r="0" t="0"/>
-            <wp:docPr descr="Web: paseos vistos por un paseador" title="" id="1054" name="Picture"/>
+            <wp:docPr descr="Web: paseos vistos por un paseador" title="" id="100" name="Picture"/>
             <a:graphic>
               <a:graphicData uri="http://schemas.openxmlformats.org/drawingml/2006/picture">
                 <pic:pic>
                   <pic:nvPicPr>
-                    <pic:cNvPr descr="capturas/web-paseos-paseador.png" id="1055" name="Picture"/>
+                    <pic:cNvPr descr="capturas/web-paseos-paseador.png" id="101" name="Picture"/>
                     <pic:cNvPicPr>
                       <a:picLocks noChangeArrowheads="1" noChangeAspect="1"/>
                     </pic:cNvPicPr>
                   </pic:nvPicPr>
                   <pic:blipFill>
-                    <a:blip r:embed="rIdCap55"/>
+                    <a:blip r:embed="rId99"/>
                     <a:stretch>
                       <a:fillRect/>
                     </a:stretch>
@@ -3794,7 +4042,7 @@
                   <pic:spPr bwMode="auto">
                     <a:xfrm>
                       <a:off x="0" y="0"/>
-                      <a:ext cx="5943600" cy="5159375"/>
+                      <a:ext cx="5334000" cy="4630208"/>
                     </a:xfrm>
                     <a:prstGeom prst="rect">
                       <a:avLst/>
@@ -3828,20 +4076,20 @@
       <w:r>
         <w:drawing>
           <wp:inline>
-            <wp:extent cx="5943600" cy="4127500"/>
+            <wp:extent cx="5334000" cy="3704166"/>
             <wp:effectExtent b="0" l="0" r="0" t="0"/>
-            <wp:docPr descr="Web: ABMC de administradores" title="" id="1056" name="Picture"/>
+            <wp:docPr descr="Web: ABMC de administradores" title="" id="103" name="Picture"/>
             <a:graphic>
               <a:graphicData uri="http://schemas.openxmlformats.org/drawingml/2006/picture">
                 <pic:pic>
                   <pic:nvPicPr>
-                    <pic:cNvPr descr="capturas/web-administradores-admin.png" id="1057" name="Picture"/>
+                    <pic:cNvPr descr="capturas/web-administradores-admin.png" id="104" name="Picture"/>
                     <pic:cNvPicPr>
                       <a:picLocks noChangeArrowheads="1" noChangeAspect="1"/>
                     </pic:cNvPicPr>
                   </pic:nvPicPr>
                   <pic:blipFill>
-                    <a:blip r:embed="rIdCap57"/>
+                    <a:blip r:embed="rId102"/>
                     <a:stretch>
                       <a:fillRect/>
                     </a:stretch>
@@ -3849,7 +4097,7 @@
                   <pic:spPr bwMode="auto">
                     <a:xfrm>
                       <a:off x="0" y="0"/>
-                      <a:ext cx="5943600" cy="4127500"/>
+                      <a:ext cx="5334000" cy="3704166"/>
                     </a:xfrm>
                     <a:prstGeom prst="rect">
                       <a:avLst/>
@@ -3883,20 +4131,20 @@
       <w:r>
         <w:drawing>
           <wp:inline>
-            <wp:extent cx="5943600" cy="5159375"/>
+            <wp:extent cx="5334000" cy="4630208"/>
             <wp:effectExtent b="0" l="0" r="0" t="0"/>
-            <wp:docPr descr="Web: liquidaciones (maestro/detalle) editando una liquidación" title="" id="1058" name="Picture"/>
+            <wp:docPr descr="Web: liquidaciones (maestro/detalle) editando una liquidación" title="" id="106" name="Picture"/>
             <a:graphic>
               <a:graphicData uri="http://schemas.openxmlformats.org/drawingml/2006/picture">
                 <pic:pic>
                   <pic:nvPicPr>
-                    <pic:cNvPr descr="capturas/web-liquidaciones-detalle.png" id="1059" name="Picture"/>
+                    <pic:cNvPr descr="capturas/web-liquidaciones-detalle.png" id="107" name="Picture"/>
                     <pic:cNvPicPr>
                       <a:picLocks noChangeArrowheads="1" noChangeAspect="1"/>
                     </pic:cNvPicPr>
                   </pic:nvPicPr>
                   <pic:blipFill>
-                    <a:blip r:embed="rIdCap59"/>
+                    <a:blip r:embed="rId105"/>
                     <a:stretch>
                       <a:fillRect/>
                     </a:stretch>
@@ -3904,7 +4152,7 @@
                   <pic:spPr bwMode="auto">
                     <a:xfrm>
                       <a:off x="0" y="0"/>
-                      <a:ext cx="5943600" cy="5159375"/>
+                      <a:ext cx="5334000" cy="4630208"/>
                     </a:xfrm>
                     <a:prstGeom prst="rect">
                       <a:avLst/>
@@ -3931,8 +4179,8 @@
         <w:t xml:space="preserve">Web: liquidaciones (maestro/detalle) editando una liquidación</w:t>
       </w:r>
     </w:p>
-    <w:bookmarkEnd w:id="18"/>
-    <w:bookmarkStart w:id="19" w:name="reportes"/>
+    <w:bookmarkEnd w:id="108"/>
+    <w:bookmarkStart w:id="121" w:name="reportes"/>
     <w:p>
       <w:pPr>
         <w:pStyle w:val="Heading2"/>
@@ -3956,20 +4204,20 @@
       <w:r>
         <w:drawing>
           <wp:inline>
-            <wp:extent cx="5943600" cy="4852487"/>
+            <wp:extent cx="5334000" cy="4354796"/>
             <wp:effectExtent b="0" l="0" r="0" t="0"/>
-            <wp:docPr descr="Escritorio: reporte de recaudación mensual por paseador" title="" id="1060" name="Picture"/>
+            <wp:docPr descr="Escritorio: reporte de recaudación mensual por paseador" title="" id="110" name="Picture"/>
             <a:graphic>
               <a:graphicData uri="http://schemas.openxmlformats.org/drawingml/2006/picture">
                 <pic:pic>
                   <pic:nvPicPr>
-                    <pic:cNvPr descr="capturas/esc-reporterecaudacion-admin.png" id="1061" name="Picture"/>
+                    <pic:cNvPr descr="capturas/esc-reporterecaudacion-admin.png" id="111" name="Picture"/>
                     <pic:cNvPicPr>
                       <a:picLocks noChangeArrowheads="1" noChangeAspect="1"/>
                     </pic:cNvPicPr>
                   </pic:nvPicPr>
                   <pic:blipFill>
-                    <a:blip r:embed="rIdCap61"/>
+                    <a:blip r:embed="rId109"/>
                     <a:stretch>
                       <a:fillRect/>
                     </a:stretch>
@@ -3977,7 +4225,7 @@
                   <pic:spPr bwMode="auto">
                     <a:xfrm>
                       <a:off x="0" y="0"/>
-                      <a:ext cx="5943600" cy="4852487"/>
+                      <a:ext cx="5334000" cy="4354796"/>
                     </a:xfrm>
                     <a:prstGeom prst="rect">
                       <a:avLst/>
@@ -4011,20 +4259,20 @@
       <w:r>
         <w:drawing>
           <wp:inline>
-            <wp:extent cx="5943600" cy="3907786"/>
+            <wp:extent cx="5334000" cy="3506987"/>
             <wp:effectExtent b="0" l="0" r="0" t="0"/>
-            <wp:docPr descr="Escritorio: reporte de actividad por perro" title="" id="1062" name="Picture"/>
+            <wp:docPr descr="Escritorio: reporte de actividad por perro" title="" id="113" name="Picture"/>
             <a:graphic>
               <a:graphicData uri="http://schemas.openxmlformats.org/drawingml/2006/picture">
                 <pic:pic>
                   <pic:nvPicPr>
-                    <pic:cNvPr descr="capturas/esc-reporteactividad-admin.png" id="1063" name="Picture"/>
+                    <pic:cNvPr descr="capturas/esc-reporteactividad-admin.png" id="114" name="Picture"/>
                     <pic:cNvPicPr>
                       <a:picLocks noChangeArrowheads="1" noChangeAspect="1"/>
                     </pic:cNvPicPr>
                   </pic:nvPicPr>
                   <pic:blipFill>
-                    <a:blip r:embed="rIdCap63"/>
+                    <a:blip r:embed="rId112"/>
                     <a:stretch>
                       <a:fillRect/>
                     </a:stretch>
@@ -4032,7 +4280,7 @@
                   <pic:spPr bwMode="auto">
                     <a:xfrm>
                       <a:off x="0" y="0"/>
-                      <a:ext cx="5943600" cy="3907786"/>
+                      <a:ext cx="5334000" cy="3506987"/>
                     </a:xfrm>
                     <a:prstGeom prst="rect">
                       <a:avLst/>
@@ -4066,20 +4314,20 @@
       <w:r>
         <w:drawing>
           <wp:inline>
-            <wp:extent cx="5943600" cy="4977765"/>
+            <wp:extent cx="5334000" cy="4467225"/>
             <wp:effectExtent b="0" l="0" r="0" t="0"/>
-            <wp:docPr descr="Web: reporte de recaudación mensual por paseador" title="" id="1064" name="Picture"/>
+            <wp:docPr descr="Web: reporte de recaudación mensual por paseador" title="" id="116" name="Picture"/>
             <a:graphic>
               <a:graphicData uri="http://schemas.openxmlformats.org/drawingml/2006/picture">
                 <pic:pic>
                   <pic:nvPicPr>
-                    <pic:cNvPr descr="capturas/web-reportes-recaudacion-admin.png" id="1065" name="Picture"/>
+                    <pic:cNvPr descr="capturas/web-reportes-recaudacion-admin.png" id="117" name="Picture"/>
                     <pic:cNvPicPr>
                       <a:picLocks noChangeArrowheads="1" noChangeAspect="1"/>
                     </pic:cNvPicPr>
                   </pic:nvPicPr>
                   <pic:blipFill>
-                    <a:blip r:embed="rIdCap65"/>
+                    <a:blip r:embed="rId115"/>
                     <a:stretch>
                       <a:fillRect/>
                     </a:stretch>
@@ -4087,7 +4335,7 @@
                   <pic:spPr bwMode="auto">
                     <a:xfrm>
                       <a:off x="0" y="0"/>
-                      <a:ext cx="5943600" cy="4977765"/>
+                      <a:ext cx="5334000" cy="4467225"/>
                     </a:xfrm>
                     <a:prstGeom prst="rect">
                       <a:avLst/>
@@ -4121,20 +4369,20 @@
       <w:r>
         <w:drawing>
           <wp:inline>
-            <wp:extent cx="5943600" cy="4127500"/>
+            <wp:extent cx="5334000" cy="3704166"/>
             <wp:effectExtent b="0" l="0" r="0" t="0"/>
-            <wp:docPr descr="Web: reporte de actividad por perro" title="" id="1066" name="Picture"/>
+            <wp:docPr descr="Web: reporte de actividad por perro" title="" id="119" name="Picture"/>
             <a:graphic>
               <a:graphicData uri="http://schemas.openxmlformats.org/drawingml/2006/picture">
                 <pic:pic>
                   <pic:nvPicPr>
-                    <pic:cNvPr descr="capturas/web-reportes-actividad-admin.png" id="1067" name="Picture"/>
+                    <pic:cNvPr descr="capturas/web-reportes-actividad-admin.png" id="120" name="Picture"/>
                     <pic:cNvPicPr>
                       <a:picLocks noChangeArrowheads="1" noChangeAspect="1"/>
                     </pic:cNvPicPr>
                   </pic:nvPicPr>
                   <pic:blipFill>
-                    <a:blip r:embed="rIdCap67"/>
+                    <a:blip r:embed="rId118"/>
                     <a:stretch>
                       <a:fillRect/>
                     </a:stretch>
@@ -4142,7 +4390,7 @@
                   <pic:spPr bwMode="auto">
                     <a:xfrm>
                       <a:off x="0" y="0"/>
-                      <a:ext cx="5943600" cy="4127500"/>
+                      <a:ext cx="5334000" cy="3704166"/>
                     </a:xfrm>
                     <a:prstGeom prst="rect">
                       <a:avLst/>
@@ -4169,9 +4417,9 @@
         <w:t xml:space="preserve">Web: reporte de actividad por perro</w:t>
       </w:r>
     </w:p>
-    <w:bookmarkEnd w:id="19"/>
-    <w:bookmarkEnd w:id="20"/>
-    <w:bookmarkStart w:id="24" w:name="modelo-de-datos"/>
+    <w:bookmarkEnd w:id="121"/>
+    <w:bookmarkEnd w:id="122"/>
+    <w:bookmarkStart w:id="126" w:name="modelo-de-datos"/>
     <w:p>
       <w:pPr>
         <w:pStyle w:val="Heading1"/>
@@ -4275,18 +4523,18 @@
           <wp:inline>
             <wp:extent cx="5334000" cy="8980714"/>
             <wp:effectExtent b="0" l="0" r="0" t="0"/>
-            <wp:docPr descr="Modelo de datos" title="" id="22" name="Picture"/>
+            <wp:docPr descr="Modelo de datos" title="" id="124" name="Picture"/>
             <a:graphic>
               <a:graphicData uri="http://schemas.openxmlformats.org/drawingml/2006/picture">
                 <pic:pic>
                   <pic:nvPicPr>
-                    <pic:cNvPr descr="diagramas/modelo-datos.png" id="23" name="Picture"/>
+                    <pic:cNvPr descr="diagramas/modelo-datos.png" id="125" name="Picture"/>
                     <pic:cNvPicPr>
                       <a:picLocks noChangeArrowheads="1" noChangeAspect="1"/>
                     </pic:cNvPicPr>
                   </pic:nvPicPr>
                   <pic:blipFill>
-                    <a:blip r:embed="rId21"/>
+                    <a:blip r:embed="rId123"/>
                     <a:stretch>
                       <a:fillRect/>
                     </a:stretch>
@@ -4520,6 +4768,36 @@
             <w:r>
               <w:t xml:space="preserve">Base de la herencia.</w:t>
             </w:r>
+            <w:r>
+              <w:t xml:space="preserve"> </w:t>
+            </w:r>
+            <w:r>
+              <w:rPr>
+                <w:rStyle w:val="VerbatimChar"/>
+              </w:rPr>
+              <w:t xml:space="preserve">Email</w:t>
+            </w:r>
+            <w:r>
+              <w:t xml:space="preserve"> </w:t>
+            </w:r>
+            <w:r>
+              <w:t xml:space="preserve">es</w:t>
+            </w:r>
+            <w:r>
+              <w:t xml:space="preserve"> </w:t>
+            </w:r>
+            <w:r>
+              <w:rPr>
+                <w:rStyle w:val="VerbatimChar"/>
+              </w:rPr>
+              <w:t xml:space="preserve">nvarchar(256)</w:t>
+            </w:r>
+            <w:r>
+              <w:t xml:space="preserve"> </w:t>
+            </w:r>
+            <w:r>
+              <w:t xml:space="preserve">con índice único.</w:t>
+            </w:r>
           </w:p>
         </w:tc>
       </w:tr>
@@ -4994,8 +5272,67 @@
         <w:t xml:space="preserve">el total de la liquidación no se guardan: se calculan.</w:t>
       </w:r>
     </w:p>
-    <w:bookmarkEnd w:id="24"/>
-    <w:bookmarkStart w:id="28" w:name="modelo-de-clases"/>
+    <w:p>
+      <w:pPr>
+        <w:pStyle w:val="BodyText"/>
+      </w:pPr>
+      <w:r>
+        <w:t xml:space="preserve">El índice único del email lo agrega la migración</w:t>
+      </w:r>
+      <w:r>
+        <w:t xml:space="preserve"> </w:t>
+      </w:r>
+      <w:r>
+        <w:rPr>
+          <w:rStyle w:val="VerbatimChar"/>
+        </w:rPr>
+        <w:t xml:space="preserve">EmailUnico</w:t>
+      </w:r>
+      <w:r>
+        <w:t xml:space="preserve">. Si una base anterior ya tenía emails</w:t>
+      </w:r>
+      <w:r>
+        <w:t xml:space="preserve"> </w:t>
+      </w:r>
+      <w:r>
+        <w:t xml:space="preserve">repetidos, esa migración le deja el email al usuario de menor Id y a los demás les antepone</w:t>
+      </w:r>
+      <w:r>
+        <w:t xml:space="preserve"> </w:t>
+      </w:r>
+      <w:r>
+        <w:rPr>
+          <w:rStyle w:val="VerbatimChar"/>
+        </w:rPr>
+        <w:t xml:space="preserve">repetido{Id}.</w:t>
+      </w:r>
+      <w:r>
+        <w:t xml:space="preserve"> </w:t>
+      </w:r>
+      <w:r>
+        <w:t xml:space="preserve">(por ejemplo</w:t>
+      </w:r>
+      <w:r>
+        <w:t xml:space="preserve"> </w:t>
+      </w:r>
+      <w:r>
+        <w:rPr>
+          <w:rStyle w:val="VerbatimChar"/>
+        </w:rPr>
+        <w:t xml:space="preserve">repetido4.admin@paseos.com</w:t>
+      </w:r>
+      <w:r>
+        <w:t xml:space="preserve">), así pueden entrar y el administrador les</w:t>
+      </w:r>
+      <w:r>
+        <w:t xml:space="preserve"> </w:t>
+      </w:r>
+      <w:r>
+        <w:t xml:space="preserve">carga un email nuevo desde el ABM.</w:t>
+      </w:r>
+    </w:p>
+    <w:bookmarkEnd w:id="126"/>
+    <w:bookmarkStart w:id="130" w:name="modelo-de-clases"/>
     <w:p>
       <w:pPr>
         <w:pStyle w:val="Heading1"/>
@@ -5066,18 +5403,18 @@
           <wp:inline>
             <wp:extent cx="5334000" cy="10055678"/>
             <wp:effectExtent b="0" l="0" r="0" t="0"/>
-            <wp:docPr descr="Modelo de clases" title="" id="26" name="Picture"/>
+            <wp:docPr descr="Modelo de clases" title="" id="128" name="Picture"/>
             <a:graphic>
               <a:graphicData uri="http://schemas.openxmlformats.org/drawingml/2006/picture">
                 <pic:pic>
                   <pic:nvPicPr>
-                    <pic:cNvPr descr="diagramas/modelo-clases.png" id="27" name="Picture"/>
+                    <pic:cNvPr descr="diagramas/modelo-clases.png" id="129" name="Picture"/>
                     <pic:cNvPicPr>
                       <a:picLocks noChangeArrowheads="1" noChangeAspect="1"/>
                     </pic:cNvPicPr>
                   </pic:nvPicPr>
                   <pic:blipFill>
-                    <a:blip r:embed="rId25"/>
+                    <a:blip r:embed="rId127"/>
                     <a:stretch>
                       <a:fillRect/>
                     </a:stretch>
@@ -5505,8 +5842,8 @@
         <w:t xml:space="preserve">.</w:t>
       </w:r>
     </w:p>
-    <w:bookmarkEnd w:id="28"/>
-    <w:bookmarkStart w:id="33" w:name="arquitectura-implementada"/>
+    <w:bookmarkEnd w:id="130"/>
+    <w:bookmarkStart w:id="135" w:name="arquitectura-implementada"/>
     <w:p>
       <w:pPr>
         <w:pStyle w:val="Heading1"/>
@@ -5522,20 +5859,20 @@
       <w:r>
         <w:drawing>
           <wp:inline>
-            <wp:extent cx="5334000" cy="6864803"/>
+            <wp:extent cx="5334000" cy="6565446"/>
             <wp:effectExtent b="0" l="0" r="0" t="0"/>
-            <wp:docPr descr="Arquitectura implementada" title="" id="30" name="Picture"/>
+            <wp:docPr descr="Arquitectura implementada" title="" id="132" name="Picture"/>
             <a:graphic>
               <a:graphicData uri="http://schemas.openxmlformats.org/drawingml/2006/picture">
                 <pic:pic>
                   <pic:nvPicPr>
-                    <pic:cNvPr descr="diagramas/arquitectura.png" id="31" name="Picture"/>
+                    <pic:cNvPr descr="diagramas/arquitectura.png" id="133" name="Picture"/>
                     <pic:cNvPicPr>
                       <a:picLocks noChangeArrowheads="1" noChangeAspect="1"/>
                     </pic:cNvPicPr>
                   </pic:nvPicPr>
                   <pic:blipFill>
-                    <a:blip r:embed="rId29"/>
+                    <a:blip r:embed="rId131"/>
                     <a:stretch>
                       <a:fillRect/>
                     </a:stretch>
@@ -5543,7 +5880,7 @@
                   <pic:spPr bwMode="auto">
                     <a:xfrm>
                       <a:off x="0" y="0"/>
-                      <a:ext cx="5334000" cy="6864803"/>
+                      <a:ext cx="5334000" cy="6565446"/>
                     </a:xfrm>
                     <a:prstGeom prst="rect">
                       <a:avLst/>
@@ -6065,7 +6402,7 @@
         <w:t xml:space="preserve">mensaje, y la pantalla lo muestra.</w:t>
       </w:r>
     </w:p>
-    <w:bookmarkStart w:id="32" w:name="Xf50ad30340dd652e3ec789bcd1ba2fc3a931a20"/>
+    <w:bookmarkStart w:id="134" w:name="Xf50ad30340dd652e3ec789bcd1ba2fc3a931a20"/>
     <w:p>
       <w:pPr>
         <w:pStyle w:val="Heading2"/>
@@ -6443,9 +6780,9 @@
         </w:tc>
       </w:tr>
     </w:tbl>
-    <w:bookmarkEnd w:id="32"/>
-    <w:bookmarkEnd w:id="33"/>
-    <w:bookmarkStart w:id="34" w:name="tecnologías-utilizadas"/>
+    <w:bookmarkEnd w:id="134"/>
+    <w:bookmarkEnd w:id="135"/>
+    <w:bookmarkStart w:id="136" w:name="tecnologías-utilizadas"/>
     <w:p>
       <w:pPr>
         <w:pStyle w:val="Heading1"/>
@@ -7157,8 +7494,8 @@
         </w:tc>
       </w:tr>
     </w:tbl>
-    <w:bookmarkEnd w:id="34"/>
-    <w:bookmarkStart w:id="35" w:name="repositorio"/>
+    <w:bookmarkEnd w:id="136"/>
+    <w:bookmarkStart w:id="137" w:name="repositorio"/>
     <w:p>
       <w:pPr>
         <w:pStyle w:val="Heading1"/>
@@ -7256,7 +7593,7 @@
         <w:t xml:space="preserve">).</w:t>
       </w:r>
     </w:p>
-    <w:bookmarkEnd w:id="35"/>
+    <w:bookmarkEnd w:id="137"/>
     <w:sectPr>
       <w:footnotePr>
         <w:numRestart w:val="eachSect"/>

</xml_diff>